<commit_message>
Add Flick Privacy action with configurable privacy controls
</commit_message>
<xml_diff>
--- a/Flick Series_MVP_기능기획서.docx
+++ b/Flick Series_MVP_기능기획서.docx
@@ -39,7 +39,7 @@
           <w:color w:val="555555"/>
           <w:sz w:val="22"/>
         </w:rPr>
-        <w:t>문서 유형: MVP 확장 기능 기획서  |  버전: v1.0  |  작성일: 2026.07.15  |  상태: 기획 확정 전 검토본</w:t>
+        <w:t>문서 유형: MVP 확장 기능 기획서  |  버전: v1.2  |  작성일: 2026.07.17  |  상태: Flick Privacy / Cancel 확정본</w:t>
       </w:r>
     </w:p>
     <w:p>
@@ -66,7 +66,7 @@
           <w:rFonts w:ascii="AppleGothic" w:hAnsi="AppleGothic" w:eastAsia="AppleGothic" w:cs="AppleGothic"/>
           <w:sz w:val="22"/>
         </w:rPr>
-        <w:t>본 문서는 Flick Series MVP 확장 범위에서 신규 기능인 Flick Focus와 Flick Hide의 제품 의도, 사용자 가치, 동작 범위, 구현 후보, 우선순위를 정리한 기능 기획서이다. 개발, 디자인, QA, 데모 준비 담당자가 동일한 기준으로 기능을 이해하고 납품 가능 여부를 판단할 수 있도록 작성한다.</w:t>
+        <w:t>본 문서는 Flick Series MVP 확장 범위에서 신규 기능인 Flick Privacy와 복구 기능인 Flick Privacy Cancel의 제품 의도, 사용자 가치, 세부 기능, 설정 범위, 구현 제약, 검수 기준을 정리한 기능 기획서이다. 개발, 디자인, QA, 데모 준비 담당자가 동일한 기준으로 기능을 이해하고 납품 가능 여부를 판단할 수 있도록 작성한다.</w:t>
       </w:r>
     </w:p>
     <w:p>
@@ -93,7 +93,7 @@
           <w:rFonts w:ascii="AppleGothic" w:hAnsi="AppleGothic" w:eastAsia="AppleGothic" w:cs="AppleGothic"/>
           <w:sz w:val="22"/>
         </w:rPr>
-        <w:t>Flick Series는 노트북 힌지, 즉 Lid의 움직임 패턴을 입력 장치로 활용하는 macOS 유틸리티 시리즈이다. 사용자는 마우스 조작이나 키보드 단축키 없이 노트북 화면을 특정 방식으로 움직여 창 정리, 집중 모드, Desktop 접근 같은 작업 환경 제어 기능을 실행한다.</w:t>
+        <w:t>Flick Series는 노트북 힌지, 즉 Lid의 움직임 패턴을 입력 장치로 활용하는 macOS 유틸리티 시리즈이다. 사용자는 마우스 조작이나 키보드 단축키 없이 노트북 화면을 특정 방식으로 움직여 창 정리, 집중 모드, 프라이버시 보호 같은 작업 환경 제어 기능을 실행한다.</w:t>
       </w:r>
     </w:p>
     <w:p>
@@ -144,7 +144,7 @@
           <w:rFonts w:ascii="AppleGothic" w:hAnsi="AppleGothic" w:eastAsia="AppleGothic" w:cs="AppleGothic"/>
           <w:sz w:val="22"/>
         </w:rPr>
-        <w:t>MVP 기능은 모두 “노트북을 닫는 동작”만으로 작업 공간을 정리하고 전환할 수 있어야 한다.</w:t>
+        <w:t>MVP 확장 기능은 “노트북을 닫는 동작”만으로 공공장소, 회의실, 이동 전 상황에서 화면 노출과 소리 노출을 즉시 줄일 수 있어야 한다.</w:t>
       </w:r>
     </w:p>
     <w:p>
@@ -361,7 +361,7 @@
                 <w:rFonts w:ascii="AppleGothic" w:hAnsi="AppleGothic" w:eastAsia="AppleGothic" w:cs="AppleGothic"/>
                 <w:sz w:val="20"/>
               </w:rPr>
-              <w:t>Flick Arrange, Flick Focus, Flick Hide</w:t>
+              <w:t>Flick Arrange, Flick Privacy, Flick Privacy Cancel</w:t>
             </w:r>
           </w:p>
         </w:tc>
@@ -631,7 +631,7 @@
                 <w:rFonts w:ascii="AppleGothic" w:hAnsi="AppleGothic" w:eastAsia="AppleGothic" w:cs="AppleGothic"/>
                 <w:sz w:val="20"/>
               </w:rPr>
-              <w:t>보류</w:t>
+              <w:t>Flick Privacy Cancel 기본 할당</w:t>
             </w:r>
           </w:p>
         </w:tc>
@@ -651,7 +651,7 @@
           <w:rFonts w:ascii="AppleGothic" w:hAnsi="AppleGothic" w:eastAsia="AppleGothic" w:cs="AppleGothic"/>
           <w:sz w:val="22"/>
         </w:rPr>
-        <w:t>현재 MVP 확장 범위에서는 Close 제스처만 기능 실행 트리거로 사용한다. Open 제스처 기반 기능은 향후 확장 아이디어로만 관리한다.</w:t>
+        <w:t>현재 MVP 확장 범위에서는 Close 제스처에 Flick Privacy를 할당하고, Close에 Flick Privacy가 할당된 경우 Open 제스처에는 기본적으로 Flick Privacy Cancel을 자동 할당한다. 단, 사용자는 Open에 할당된 기능을 자유롭게 다른 기능으로 수정할 수 있어야 한다.</w:t>
       </w:r>
     </w:p>
     <w:p>
@@ -916,7 +916,7 @@
                 <w:rFonts w:ascii="AppleGothic" w:hAnsi="AppleGothic" w:eastAsia="AppleGothic" w:cs="AppleGothic"/>
                 <w:sz w:val="20"/>
               </w:rPr>
-              <w:t>Flick Focus</w:t>
+              <w:t>Flick Privacy</w:t>
             </w:r>
           </w:p>
         </w:tc>
@@ -952,7 +952,7 @@
                 <w:rFonts w:ascii="AppleGothic" w:hAnsi="AppleGothic" w:eastAsia="AppleGothic" w:cs="AppleGothic"/>
                 <w:sz w:val="20"/>
               </w:rPr>
-              <w:t>신규 구현</w:t>
+              <w:t>신규 구현 확정</w:t>
             </w:r>
           </w:p>
         </w:tc>
@@ -970,7 +970,7 @@
                 <w:rFonts w:ascii="AppleGothic" w:hAnsi="AppleGothic" w:eastAsia="AppleGothic" w:cs="AppleGothic"/>
                 <w:sz w:val="20"/>
               </w:rPr>
-              <w:t>현재 작업 중인 창만 남겨 집중 환경을 만든다.</w:t>
+              <w:t>밝기, 소리, 민감 앱, 업무 모드, 미디어, 창 숨김을 한 번에 적용한다.</w:t>
             </w:r>
           </w:p>
         </w:tc>
@@ -990,7 +990,7 @@
                 <w:rFonts w:ascii="AppleGothic" w:hAnsi="AppleGothic" w:eastAsia="AppleGothic" w:cs="AppleGothic"/>
                 <w:sz w:val="20"/>
               </w:rPr>
-              <w:t>P2</w:t>
+              <w:t>P1</w:t>
             </w:r>
           </w:p>
         </w:tc>
@@ -1008,7 +1008,7 @@
                 <w:rFonts w:ascii="AppleGothic" w:hAnsi="AppleGothic" w:eastAsia="AppleGothic" w:cs="AppleGothic"/>
                 <w:sz w:val="20"/>
               </w:rPr>
-              <w:t>Flick Hide</w:t>
+              <w:t>Flick Privacy Cancel</w:t>
             </w:r>
           </w:p>
         </w:tc>
@@ -1026,7 +1026,7 @@
                 <w:rFonts w:ascii="AppleGothic" w:hAnsi="AppleGothic" w:eastAsia="AppleGothic" w:cs="AppleGothic"/>
                 <w:sz w:val="20"/>
               </w:rPr>
-              <w:t>Close</w:t>
+              <w:t>Open</w:t>
             </w:r>
           </w:p>
         </w:tc>
@@ -1044,7 +1044,7 @@
                 <w:rFonts w:ascii="AppleGothic" w:hAnsi="AppleGothic" w:eastAsia="AppleGothic" w:cs="AppleGothic"/>
                 <w:sz w:val="20"/>
               </w:rPr>
-              <w:t>신규 구현</w:t>
+              <w:t>신규 구현 확정</w:t>
             </w:r>
           </w:p>
         </w:tc>
@@ -1062,7 +1062,7 @@
                 <w:rFonts w:ascii="AppleGothic" w:hAnsi="AppleGothic" w:eastAsia="AppleGothic" w:cs="AppleGothic"/>
                 <w:sz w:val="20"/>
               </w:rPr>
-              <w:t>모든 창을 숨겨 Desktop에 즉시 접근한다.</w:t>
+              <w:t>Flick Privacy 실행 이전 환경을 가능한 한 정확히 복구한다.</w:t>
             </w:r>
           </w:p>
         </w:tc>
@@ -1370,7 +1370,7 @@
           <w:color w:val="000000"/>
           <w:sz w:val="32"/>
         </w:rPr>
-        <w:t>6.2 Flick Focus</w:t>
+        <w:t>6.2 Flick Privacy</w:t>
       </w:r>
     </w:p>
     <w:tbl>
@@ -1503,7 +1503,7 @@
                 <w:rFonts w:ascii="AppleGothic" w:hAnsi="AppleGothic" w:eastAsia="AppleGothic" w:cs="AppleGothic"/>
                 <w:sz w:val="20"/>
               </w:rPr>
-              <w:t>현재 작업 중인 창에 집중하도록 주변 작업 환경을 정리한다.</w:t>
+              <w:t>노트북 환경에서 화면 노출, 소리 노출, 민감 앱 노출을 즉시 줄여 프라이버시 작업 상태로 전환한다.</w:t>
             </w:r>
           </w:p>
         </w:tc>
@@ -1541,7 +1541,7 @@
                 <w:rFonts w:ascii="AppleGothic" w:hAnsi="AppleGothic" w:eastAsia="AppleGothic" w:cs="AppleGothic"/>
                 <w:sz w:val="20"/>
               </w:rPr>
-              <w:t>현재 활성 창(active window)을 제외한 모든 일반 앱 창을 숨긴다.</w:t>
+              <w:t>사용자가 켠 세부 기능을 순차 실행해 밝기, 볼륨, 민감 앱, 업무 모드, 미디어 재생, 창 표시 상태를 제어한다.</w:t>
             </w:r>
           </w:p>
         </w:tc>
@@ -1561,7 +1561,7 @@
                 <w:rFonts w:ascii="AppleGothic" w:hAnsi="AppleGothic" w:eastAsia="AppleGothic" w:cs="AppleGothic"/>
                 <w:sz w:val="20"/>
               </w:rPr>
-              <w:t>실행 전 예시</w:t>
+              <w:t>사용 맥락</w:t>
             </w:r>
           </w:p>
         </w:tc>
@@ -1579,7 +1579,7 @@
                 <w:rFonts w:ascii="AppleGothic" w:hAnsi="AppleGothic" w:eastAsia="AppleGothic" w:cs="AppleGothic"/>
                 <w:sz w:val="20"/>
               </w:rPr>
-              <w:t>Chrome, VSCode(활성), Discord, Finder</w:t>
+              <w:t>카페, 회의실, 도서관, 이동 직전처럼 노트북 화면과 소리가 주변에 노출될 수 있는 상황</w:t>
             </w:r>
           </w:p>
         </w:tc>
@@ -1599,7 +1599,7 @@
                 <w:rFonts w:ascii="AppleGothic" w:hAnsi="AppleGothic" w:eastAsia="AppleGothic" w:cs="AppleGothic"/>
                 <w:sz w:val="20"/>
               </w:rPr>
-              <w:t>실행 후 예시</w:t>
+              <w:t>MVP 기준</w:t>
             </w:r>
           </w:p>
         </w:tc>
@@ -1617,7 +1617,7 @@
                 <w:rFonts w:ascii="AppleGothic" w:hAnsi="AppleGothic" w:eastAsia="AppleGothic" w:cs="AppleGothic"/>
                 <w:sz w:val="20"/>
               </w:rPr>
-              <w:t>VSCode만 표시하고 나머지 창은 숨김 상태로 전환한다.</w:t>
+              <w:t>Flick Privacy를 신규 확정 기능으로 구현하며, Flick Focus는 Privacy 내부 세부 기능으로 재사용한다. Privacy 실행 전 상태는 Flick Privacy Cancel이 복구할 수 있도록 스냅샷으로 저장한다.</w:t>
             </w:r>
           </w:p>
         </w:tc>
@@ -1640,7 +1640,779 @@
           <w:color w:val="434343"/>
           <w:sz w:val="28"/>
         </w:rPr>
-        <w:t>포함 범위</w:t>
+        <w:t>세부 기능 설정</w:t>
+      </w:r>
+    </w:p>
+    <w:tbl>
+      <w:tblPr>
+        <w:tblStyle w:val="TableGrid"/>
+        <w:tblW w:type="dxa" w:w="9360"/>
+        <w:tblLayout w:type="fixed"/>
+        <w:tblLook w:firstColumn="1" w:firstRow="1" w:lastColumn="0" w:lastRow="0" w:noHBand="0" w:noVBand="1" w:val="04A0"/>
+        <w:tblCellMar>
+          <w:top w:w="80" w:type="dxa"/>
+          <w:start w:w="120" w:type="dxa"/>
+          <w:bottom w:w="80" w:type="dxa"/>
+          <w:end w:w="120" w:type="dxa"/>
+        </w:tblCellMar>
+      </w:tblPr>
+      <w:tblGrid>
+        <w:gridCol w:w="2340"/>
+        <w:gridCol w:w="2340"/>
+        <w:gridCol w:w="2340"/>
+        <w:gridCol w:w="2340"/>
+      </w:tblGrid>
+      <w:tr>
+        <w:tc>
+          <w:tcPr>
+            <w:tcW w:type="dxa" w:w="800"/>
+            <w:vAlign w:val="center"/>
+            <w:shd w:fill="F8F9FA"/>
+          </w:tcPr>
+          <w:p>
+            <w:pPr>
+              <w:spacing w:before="0" w:after="80"/>
+            </w:pPr>
+            <w:r>
+              <w:rPr>
+                <w:rFonts w:ascii="AppleGothic" w:hAnsi="AppleGothic" w:eastAsia="AppleGothic" w:cs="AppleGothic"/>
+                <w:b/>
+                <w:sz w:val="20"/>
+              </w:rPr>
+              <w:t>번호</w:t>
+            </w:r>
+          </w:p>
+        </w:tc>
+        <w:tc>
+          <w:tcPr>
+            <w:tcW w:type="dxa" w:w="4200"/>
+            <w:vAlign w:val="center"/>
+            <w:shd w:fill="F8F9FA"/>
+          </w:tcPr>
+          <w:p>
+            <w:pPr>
+              <w:spacing w:before="0" w:after="80"/>
+            </w:pPr>
+            <w:r>
+              <w:rPr>
+                <w:rFonts w:ascii="AppleGothic" w:hAnsi="AppleGothic" w:eastAsia="AppleGothic" w:cs="AppleGothic"/>
+                <w:b/>
+                <w:sz w:val="20"/>
+              </w:rPr>
+              <w:t>세부 기능</w:t>
+            </w:r>
+          </w:p>
+        </w:tc>
+        <w:tc>
+          <w:tcPr>
+            <w:tcW w:type="dxa" w:w="1560"/>
+            <w:vAlign w:val="center"/>
+            <w:shd w:fill="F8F9FA"/>
+          </w:tcPr>
+          <w:p>
+            <w:pPr>
+              <w:spacing w:before="0" w:after="80"/>
+            </w:pPr>
+            <w:r>
+              <w:rPr>
+                <w:rFonts w:ascii="AppleGothic" w:hAnsi="AppleGothic" w:eastAsia="AppleGothic" w:cs="AppleGothic"/>
+                <w:b/>
+                <w:sz w:val="20"/>
+              </w:rPr>
+              <w:t>기본값</w:t>
+            </w:r>
+          </w:p>
+        </w:tc>
+        <w:tc>
+          <w:tcPr>
+            <w:tcW w:type="dxa" w:w="2800"/>
+            <w:vAlign w:val="center"/>
+            <w:shd w:fill="F8F9FA"/>
+          </w:tcPr>
+          <w:p>
+            <w:pPr>
+              <w:spacing w:before="0" w:after="80"/>
+            </w:pPr>
+            <w:r>
+              <w:rPr>
+                <w:rFonts w:ascii="AppleGothic" w:hAnsi="AppleGothic" w:eastAsia="AppleGothic" w:cs="AppleGothic"/>
+                <w:b/>
+                <w:sz w:val="20"/>
+              </w:rPr>
+              <w:t>설정 방식</w:t>
+            </w:r>
+          </w:p>
+        </w:tc>
+      </w:tr>
+      <w:tr>
+        <w:tc>
+          <w:tcPr>
+            <w:tcW w:type="dxa" w:w="800"/>
+            <w:vAlign w:val="center"/>
+          </w:tcPr>
+          <w:p>
+            <w:pPr>
+              <w:spacing w:before="0" w:after="80"/>
+            </w:pPr>
+            <w:r>
+              <w:rPr>
+                <w:rFonts w:ascii="AppleGothic" w:hAnsi="AppleGothic" w:eastAsia="AppleGothic" w:cs="AppleGothic"/>
+                <w:sz w:val="20"/>
+              </w:rPr>
+              <w:t>1</w:t>
+            </w:r>
+          </w:p>
+        </w:tc>
+        <w:tc>
+          <w:tcPr>
+            <w:tcW w:type="dxa" w:w="4200"/>
+            <w:vAlign w:val="center"/>
+          </w:tcPr>
+          <w:p>
+            <w:pPr>
+              <w:spacing w:before="0" w:after="80"/>
+            </w:pPr>
+            <w:r>
+              <w:rPr>
+                <w:rFonts w:ascii="AppleGothic" w:hAnsi="AppleGothic" w:eastAsia="AppleGothic" w:cs="AppleGothic"/>
+                <w:sz w:val="20"/>
+              </w:rPr>
+              <w:t>화면 밝기를 전체 밝기 기준 30%로 낮추기</w:t>
+            </w:r>
+          </w:p>
+        </w:tc>
+        <w:tc>
+          <w:tcPr>
+            <w:tcW w:type="dxa" w:w="1560"/>
+            <w:vAlign w:val="center"/>
+          </w:tcPr>
+          <w:p>
+            <w:pPr>
+              <w:spacing w:before="0" w:after="80"/>
+            </w:pPr>
+            <w:r>
+              <w:rPr>
+                <w:rFonts w:ascii="AppleGothic" w:hAnsi="AppleGothic" w:eastAsia="AppleGothic" w:cs="AppleGothic"/>
+                <w:sz w:val="20"/>
+              </w:rPr>
+              <w:t>ON / 30%</w:t>
+            </w:r>
+          </w:p>
+        </w:tc>
+        <w:tc>
+          <w:tcPr>
+            <w:tcW w:type="dxa" w:w="2800"/>
+            <w:vAlign w:val="center"/>
+          </w:tcPr>
+          <w:p>
+            <w:pPr>
+              <w:spacing w:before="0" w:after="80"/>
+            </w:pPr>
+            <w:r>
+              <w:rPr>
+                <w:rFonts w:ascii="AppleGothic" w:hAnsi="AppleGothic" w:eastAsia="AppleGothic" w:cs="AppleGothic"/>
+                <w:sz w:val="20"/>
+              </w:rPr>
+              <w:t>토글 및 0~100% 슬라이더</w:t>
+            </w:r>
+          </w:p>
+        </w:tc>
+      </w:tr>
+      <w:tr>
+        <w:tc>
+          <w:tcPr>
+            <w:tcW w:type="dxa" w:w="800"/>
+            <w:vAlign w:val="center"/>
+          </w:tcPr>
+          <w:p>
+            <w:pPr>
+              <w:spacing w:before="0" w:after="80"/>
+            </w:pPr>
+            <w:r>
+              <w:rPr>
+                <w:rFonts w:ascii="AppleGothic" w:hAnsi="AppleGothic" w:eastAsia="AppleGothic" w:cs="AppleGothic"/>
+                <w:sz w:val="20"/>
+              </w:rPr>
+              <w:t>2</w:t>
+            </w:r>
+          </w:p>
+        </w:tc>
+        <w:tc>
+          <w:tcPr>
+            <w:tcW w:type="dxa" w:w="4200"/>
+            <w:vAlign w:val="center"/>
+          </w:tcPr>
+          <w:p>
+            <w:pPr>
+              <w:spacing w:before="0" w:after="80"/>
+            </w:pPr>
+            <w:r>
+              <w:rPr>
+                <w:rFonts w:ascii="AppleGothic" w:hAnsi="AppleGothic" w:eastAsia="AppleGothic" w:cs="AppleGothic"/>
+                <w:sz w:val="20"/>
+              </w:rPr>
+              <w:t>시스템 볼륨을 0%로 만들기</w:t>
+            </w:r>
+          </w:p>
+        </w:tc>
+        <w:tc>
+          <w:tcPr>
+            <w:tcW w:type="dxa" w:w="1560"/>
+            <w:vAlign w:val="center"/>
+          </w:tcPr>
+          <w:p>
+            <w:pPr>
+              <w:spacing w:before="0" w:after="80"/>
+            </w:pPr>
+            <w:r>
+              <w:rPr>
+                <w:rFonts w:ascii="AppleGothic" w:hAnsi="AppleGothic" w:eastAsia="AppleGothic" w:cs="AppleGothic"/>
+                <w:sz w:val="20"/>
+              </w:rPr>
+              <w:t>ON</w:t>
+            </w:r>
+          </w:p>
+        </w:tc>
+        <w:tc>
+          <w:tcPr>
+            <w:tcW w:type="dxa" w:w="2800"/>
+            <w:vAlign w:val="center"/>
+          </w:tcPr>
+          <w:p>
+            <w:pPr>
+              <w:spacing w:before="0" w:after="80"/>
+            </w:pPr>
+            <w:r>
+              <w:rPr>
+                <w:rFonts w:ascii="AppleGothic" w:hAnsi="AppleGothic" w:eastAsia="AppleGothic" w:cs="AppleGothic"/>
+                <w:sz w:val="20"/>
+              </w:rPr>
+              <w:t>토글</w:t>
+            </w:r>
+          </w:p>
+        </w:tc>
+      </w:tr>
+      <w:tr>
+        <w:tc>
+          <w:tcPr>
+            <w:tcW w:type="dxa" w:w="800"/>
+            <w:vAlign w:val="center"/>
+          </w:tcPr>
+          <w:p>
+            <w:pPr>
+              <w:spacing w:before="0" w:after="80"/>
+            </w:pPr>
+            <w:r>
+              <w:rPr>
+                <w:rFonts w:ascii="AppleGothic" w:hAnsi="AppleGothic" w:eastAsia="AppleGothic" w:cs="AppleGothic"/>
+                <w:sz w:val="20"/>
+              </w:rPr>
+              <w:t>3</w:t>
+            </w:r>
+          </w:p>
+        </w:tc>
+        <w:tc>
+          <w:tcPr>
+            <w:tcW w:type="dxa" w:w="4200"/>
+            <w:vAlign w:val="center"/>
+          </w:tcPr>
+          <w:p>
+            <w:pPr>
+              <w:spacing w:before="0" w:after="80"/>
+            </w:pPr>
+            <w:r>
+              <w:rPr>
+                <w:rFonts w:ascii="AppleGothic" w:hAnsi="AppleGothic" w:eastAsia="AppleGothic" w:cs="AppleGothic"/>
+                <w:sz w:val="20"/>
+              </w:rPr>
+              <w:t>메신저 및 메일 앱 숨기기</w:t>
+            </w:r>
+          </w:p>
+        </w:tc>
+        <w:tc>
+          <w:tcPr>
+            <w:tcW w:type="dxa" w:w="1560"/>
+            <w:vAlign w:val="center"/>
+          </w:tcPr>
+          <w:p>
+            <w:pPr>
+              <w:spacing w:before="0" w:after="80"/>
+            </w:pPr>
+            <w:r>
+              <w:rPr>
+                <w:rFonts w:ascii="AppleGothic" w:hAnsi="AppleGothic" w:eastAsia="AppleGothic" w:cs="AppleGothic"/>
+                <w:sz w:val="20"/>
+              </w:rPr>
+              <w:t>ON</w:t>
+            </w:r>
+          </w:p>
+        </w:tc>
+        <w:tc>
+          <w:tcPr>
+            <w:tcW w:type="dxa" w:w="2800"/>
+            <w:vAlign w:val="center"/>
+          </w:tcPr>
+          <w:p>
+            <w:pPr>
+              <w:spacing w:before="0" w:after="80"/>
+            </w:pPr>
+            <w:r>
+              <w:rPr>
+                <w:rFonts w:ascii="AppleGothic" w:hAnsi="AppleGothic" w:eastAsia="AppleGothic" w:cs="AppleGothic"/>
+                <w:sz w:val="20"/>
+              </w:rPr>
+              <w:t>기본 앱 목록 + 사용자 추가/삭제 목록</w:t>
+            </w:r>
+          </w:p>
+        </w:tc>
+      </w:tr>
+      <w:tr>
+        <w:tc>
+          <w:tcPr>
+            <w:tcW w:type="dxa" w:w="800"/>
+            <w:vAlign w:val="center"/>
+          </w:tcPr>
+          <w:p>
+            <w:pPr>
+              <w:spacing w:before="0" w:after="80"/>
+            </w:pPr>
+            <w:r>
+              <w:rPr>
+                <w:rFonts w:ascii="AppleGothic" w:hAnsi="AppleGothic" w:eastAsia="AppleGothic" w:cs="AppleGothic"/>
+                <w:sz w:val="20"/>
+              </w:rPr>
+              <w:t>4</w:t>
+            </w:r>
+          </w:p>
+        </w:tc>
+        <w:tc>
+          <w:tcPr>
+            <w:tcW w:type="dxa" w:w="4200"/>
+            <w:vAlign w:val="center"/>
+          </w:tcPr>
+          <w:p>
+            <w:pPr>
+              <w:spacing w:before="0" w:after="80"/>
+            </w:pPr>
+            <w:r>
+              <w:rPr>
+                <w:rFonts w:ascii="AppleGothic" w:hAnsi="AppleGothic" w:eastAsia="AppleGothic" w:cs="AppleGothic"/>
+                <w:sz w:val="20"/>
+              </w:rPr>
+              <w:t>업무 모드로 전환하기</w:t>
+            </w:r>
+          </w:p>
+        </w:tc>
+        <w:tc>
+          <w:tcPr>
+            <w:tcW w:type="dxa" w:w="1560"/>
+            <w:vAlign w:val="center"/>
+          </w:tcPr>
+          <w:p>
+            <w:pPr>
+              <w:spacing w:before="0" w:after="80"/>
+            </w:pPr>
+            <w:r>
+              <w:rPr>
+                <w:rFonts w:ascii="AppleGothic" w:hAnsi="AppleGothic" w:eastAsia="AppleGothic" w:cs="AppleGothic"/>
+                <w:sz w:val="20"/>
+              </w:rPr>
+              <w:t>ON</w:t>
+            </w:r>
+          </w:p>
+        </w:tc>
+        <w:tc>
+          <w:tcPr>
+            <w:tcW w:type="dxa" w:w="2800"/>
+            <w:vAlign w:val="center"/>
+          </w:tcPr>
+          <w:p>
+            <w:pPr>
+              <w:spacing w:before="0" w:after="80"/>
+            </w:pPr>
+            <w:r>
+              <w:rPr>
+                <w:rFonts w:ascii="AppleGothic" w:hAnsi="AppleGothic" w:eastAsia="AppleGothic" w:cs="AppleGothic"/>
+                <w:sz w:val="20"/>
+              </w:rPr>
+              <w:t>토글</w:t>
+            </w:r>
+          </w:p>
+        </w:tc>
+      </w:tr>
+      <w:tr>
+        <w:tc>
+          <w:tcPr>
+            <w:tcW w:type="dxa" w:w="800"/>
+            <w:vAlign w:val="center"/>
+          </w:tcPr>
+          <w:p>
+            <w:pPr>
+              <w:spacing w:before="0" w:after="80"/>
+            </w:pPr>
+            <w:r>
+              <w:rPr>
+                <w:rFonts w:ascii="AppleGothic" w:hAnsi="AppleGothic" w:eastAsia="AppleGothic" w:cs="AppleGothic"/>
+                <w:sz w:val="20"/>
+              </w:rPr>
+              <w:t>5</w:t>
+            </w:r>
+          </w:p>
+        </w:tc>
+        <w:tc>
+          <w:tcPr>
+            <w:tcW w:type="dxa" w:w="4200"/>
+            <w:vAlign w:val="center"/>
+          </w:tcPr>
+          <w:p>
+            <w:pPr>
+              <w:spacing w:before="0" w:after="80"/>
+            </w:pPr>
+            <w:r>
+              <w:rPr>
+                <w:rFonts w:ascii="AppleGothic" w:hAnsi="AppleGothic" w:eastAsia="AppleGothic" w:cs="AppleGothic"/>
+                <w:sz w:val="20"/>
+              </w:rPr>
+              <w:t>현재 시스템 미디어 재생 일시정지</w:t>
+            </w:r>
+          </w:p>
+        </w:tc>
+        <w:tc>
+          <w:tcPr>
+            <w:tcW w:type="dxa" w:w="1560"/>
+            <w:vAlign w:val="center"/>
+          </w:tcPr>
+          <w:p>
+            <w:pPr>
+              <w:spacing w:before="0" w:after="80"/>
+            </w:pPr>
+            <w:r>
+              <w:rPr>
+                <w:rFonts w:ascii="AppleGothic" w:hAnsi="AppleGothic" w:eastAsia="AppleGothic" w:cs="AppleGothic"/>
+                <w:sz w:val="20"/>
+              </w:rPr>
+              <w:t>ON</w:t>
+            </w:r>
+          </w:p>
+        </w:tc>
+        <w:tc>
+          <w:tcPr>
+            <w:tcW w:type="dxa" w:w="2800"/>
+            <w:vAlign w:val="center"/>
+          </w:tcPr>
+          <w:p>
+            <w:pPr>
+              <w:spacing w:before="0" w:after="80"/>
+            </w:pPr>
+            <w:r>
+              <w:rPr>
+                <w:rFonts w:ascii="AppleGothic" w:hAnsi="AppleGothic" w:eastAsia="AppleGothic" w:cs="AppleGothic"/>
+                <w:sz w:val="20"/>
+              </w:rPr>
+              <w:t>토글</w:t>
+            </w:r>
+          </w:p>
+        </w:tc>
+      </w:tr>
+      <w:tr>
+        <w:tc>
+          <w:tcPr>
+            <w:tcW w:type="dxa" w:w="800"/>
+            <w:vAlign w:val="center"/>
+          </w:tcPr>
+          <w:p>
+            <w:pPr>
+              <w:spacing w:before="0" w:after="80"/>
+            </w:pPr>
+            <w:r>
+              <w:rPr>
+                <w:rFonts w:ascii="AppleGothic" w:hAnsi="AppleGothic" w:eastAsia="AppleGothic" w:cs="AppleGothic"/>
+                <w:sz w:val="20"/>
+              </w:rPr>
+              <w:t>6</w:t>
+            </w:r>
+          </w:p>
+        </w:tc>
+        <w:tc>
+          <w:tcPr>
+            <w:tcW w:type="dxa" w:w="4200"/>
+            <w:vAlign w:val="center"/>
+          </w:tcPr>
+          <w:p>
+            <w:pPr>
+              <w:spacing w:before="0" w:after="80"/>
+            </w:pPr>
+            <w:r>
+              <w:rPr>
+                <w:rFonts w:ascii="AppleGothic" w:hAnsi="AppleGothic" w:eastAsia="AppleGothic" w:cs="AppleGothic"/>
+                <w:sz w:val="20"/>
+              </w:rPr>
+              <w:t>현재 창 외 나머지 숨김</w:t>
+            </w:r>
+          </w:p>
+        </w:tc>
+        <w:tc>
+          <w:tcPr>
+            <w:tcW w:type="dxa" w:w="1560"/>
+            <w:vAlign w:val="center"/>
+          </w:tcPr>
+          <w:p>
+            <w:pPr>
+              <w:spacing w:before="0" w:after="80"/>
+            </w:pPr>
+            <w:r>
+              <w:rPr>
+                <w:rFonts w:ascii="AppleGothic" w:hAnsi="AppleGothic" w:eastAsia="AppleGothic" w:cs="AppleGothic"/>
+                <w:sz w:val="20"/>
+              </w:rPr>
+              <w:t>ON</w:t>
+            </w:r>
+          </w:p>
+        </w:tc>
+        <w:tc>
+          <w:tcPr>
+            <w:tcW w:type="dxa" w:w="2800"/>
+            <w:vAlign w:val="center"/>
+          </w:tcPr>
+          <w:p>
+            <w:pPr>
+              <w:spacing w:before="0" w:after="80"/>
+            </w:pPr>
+            <w:r>
+              <w:rPr>
+                <w:rFonts w:ascii="AppleGothic" w:hAnsi="AppleGothic" w:eastAsia="AppleGothic" w:cs="AppleGothic"/>
+                <w:sz w:val="20"/>
+              </w:rPr>
+              <w:t>토글 / Flick Focus 로직 재사용</w:t>
+            </w:r>
+          </w:p>
+        </w:tc>
+      </w:tr>
+    </w:tbl>
+    <w:p>
+      <w:pPr>
+        <w:spacing w:after="80"/>
+      </w:pPr>
+    </w:p>
+    <w:p>
+      <w:pPr>
+        <w:pStyle w:val="Heading3"/>
+        <w:spacing w:before="320" w:after="80"/>
+      </w:pPr>
+      <w:r>
+        <w:rPr>
+          <w:rFonts w:ascii="AppleGothic" w:hAnsi="AppleGothic" w:eastAsia="AppleGothic" w:cs="AppleGothic"/>
+          <w:b w:val="0"/>
+          <w:color w:val="434343"/>
+          <w:sz w:val="28"/>
+        </w:rPr>
+        <w:t>기본 숨김 대상 앱</w:t>
+      </w:r>
+    </w:p>
+    <w:p>
+      <w:pPr>
+        <w:spacing w:after="160" w:line="276" w:lineRule="auto"/>
+      </w:pPr>
+      <w:r>
+        <w:rPr>
+          <w:rFonts w:ascii="AppleGothic" w:hAnsi="AppleGothic" w:eastAsia="AppleGothic" w:cs="AppleGothic"/>
+          <w:sz w:val="22"/>
+        </w:rPr>
+        <w:t>메신저/메일 앱 숨김은 macOS가 앱을 의미론적으로 자동 분류하는 방식이 아니라, 번들 ID 또는 실행 앱 이름 목록 기반으로 구현한다. 사용자는 Privacy 설정에서 숨김 대상 앱을 추가하거나 삭제할 수 있어야 한다.</w:t>
+      </w:r>
+    </w:p>
+    <w:tbl>
+      <w:tblPr>
+        <w:tblStyle w:val="TableGrid"/>
+        <w:tblW w:type="dxa" w:w="9360"/>
+        <w:tblLayout w:type="fixed"/>
+        <w:tblLook w:firstColumn="1" w:firstRow="1" w:lastColumn="0" w:lastRow="0" w:noHBand="0" w:noVBand="1" w:val="04A0"/>
+        <w:tblCellMar>
+          <w:top w:w="80" w:type="dxa"/>
+          <w:start w:w="120" w:type="dxa"/>
+          <w:bottom w:w="80" w:type="dxa"/>
+          <w:end w:w="120" w:type="dxa"/>
+        </w:tblCellMar>
+      </w:tblPr>
+      <w:tblGrid>
+        <w:gridCol w:w="4680"/>
+        <w:gridCol w:w="4680"/>
+      </w:tblGrid>
+      <w:tr>
+        <w:tc>
+          <w:tcPr>
+            <w:tcW w:type="dxa" w:w="1800"/>
+            <w:vAlign w:val="center"/>
+            <w:shd w:fill="F8F9FA"/>
+          </w:tcPr>
+          <w:p>
+            <w:pPr>
+              <w:spacing w:before="0" w:after="80"/>
+            </w:pPr>
+            <w:r>
+              <w:rPr>
+                <w:rFonts w:ascii="AppleGothic" w:hAnsi="AppleGothic" w:eastAsia="AppleGothic" w:cs="AppleGothic"/>
+                <w:b/>
+                <w:sz w:val="20"/>
+              </w:rPr>
+              <w:t>분류</w:t>
+            </w:r>
+          </w:p>
+        </w:tc>
+        <w:tc>
+          <w:tcPr>
+            <w:tcW w:type="dxa" w:w="7560"/>
+            <w:vAlign w:val="center"/>
+            <w:shd w:fill="F8F9FA"/>
+          </w:tcPr>
+          <w:p>
+            <w:pPr>
+              <w:spacing w:before="0" w:after="80"/>
+            </w:pPr>
+            <w:r>
+              <w:rPr>
+                <w:rFonts w:ascii="AppleGothic" w:hAnsi="AppleGothic" w:eastAsia="AppleGothic" w:cs="AppleGothic"/>
+                <w:b/>
+                <w:sz w:val="20"/>
+              </w:rPr>
+              <w:t>기본 대상</w:t>
+            </w:r>
+          </w:p>
+        </w:tc>
+      </w:tr>
+      <w:tr>
+        <w:tc>
+          <w:tcPr>
+            <w:tcW w:type="dxa" w:w="1800"/>
+            <w:vAlign w:val="center"/>
+          </w:tcPr>
+          <w:p>
+            <w:pPr>
+              <w:spacing w:before="0" w:after="80"/>
+            </w:pPr>
+            <w:r>
+              <w:rPr>
+                <w:rFonts w:ascii="AppleGothic" w:hAnsi="AppleGothic" w:eastAsia="AppleGothic" w:cs="AppleGothic"/>
+                <w:sz w:val="20"/>
+              </w:rPr>
+              <w:t>메신저</w:t>
+            </w:r>
+          </w:p>
+        </w:tc>
+        <w:tc>
+          <w:tcPr>
+            <w:tcW w:type="dxa" w:w="7560"/>
+            <w:vAlign w:val="center"/>
+          </w:tcPr>
+          <w:p>
+            <w:pPr>
+              <w:spacing w:before="0" w:after="80"/>
+            </w:pPr>
+            <w:r>
+              <w:rPr>
+                <w:rFonts w:ascii="AppleGothic" w:hAnsi="AppleGothic" w:eastAsia="AppleGothic" w:cs="AppleGothic"/>
+                <w:sz w:val="20"/>
+              </w:rPr>
+              <w:t>KakaoTalk, Messages/iMessage, Slack, Discord, Telegram, WhatsApp, Messenger</w:t>
+            </w:r>
+          </w:p>
+        </w:tc>
+      </w:tr>
+      <w:tr>
+        <w:tc>
+          <w:tcPr>
+            <w:tcW w:type="dxa" w:w="1800"/>
+            <w:vAlign w:val="center"/>
+          </w:tcPr>
+          <w:p>
+            <w:pPr>
+              <w:spacing w:before="0" w:after="80"/>
+            </w:pPr>
+            <w:r>
+              <w:rPr>
+                <w:rFonts w:ascii="AppleGothic" w:hAnsi="AppleGothic" w:eastAsia="AppleGothic" w:cs="AppleGothic"/>
+                <w:sz w:val="20"/>
+              </w:rPr>
+              <w:t>메일</w:t>
+            </w:r>
+          </w:p>
+        </w:tc>
+        <w:tc>
+          <w:tcPr>
+            <w:tcW w:type="dxa" w:w="7560"/>
+            <w:vAlign w:val="center"/>
+          </w:tcPr>
+          <w:p>
+            <w:pPr>
+              <w:spacing w:before="0" w:after="80"/>
+            </w:pPr>
+            <w:r>
+              <w:rPr>
+                <w:rFonts w:ascii="AppleGothic" w:hAnsi="AppleGothic" w:eastAsia="AppleGothic" w:cs="AppleGothic"/>
+                <w:sz w:val="20"/>
+              </w:rPr>
+              <w:t>Mail / Apple Mail / iMail</w:t>
+            </w:r>
+          </w:p>
+        </w:tc>
+      </w:tr>
+      <w:tr>
+        <w:tc>
+          <w:tcPr>
+            <w:tcW w:type="dxa" w:w="1800"/>
+            <w:vAlign w:val="center"/>
+          </w:tcPr>
+          <w:p>
+            <w:pPr>
+              <w:spacing w:before="0" w:after="80"/>
+            </w:pPr>
+            <w:r>
+              <w:rPr>
+                <w:rFonts w:ascii="AppleGothic" w:hAnsi="AppleGothic" w:eastAsia="AppleGothic" w:cs="AppleGothic"/>
+                <w:sz w:val="20"/>
+              </w:rPr>
+              <w:t>사용자 지정</w:t>
+            </w:r>
+          </w:p>
+        </w:tc>
+        <w:tc>
+          <w:tcPr>
+            <w:tcW w:type="dxa" w:w="7560"/>
+            <w:vAlign w:val="center"/>
+          </w:tcPr>
+          <w:p>
+            <w:pPr>
+              <w:spacing w:before="0" w:after="80"/>
+            </w:pPr>
+            <w:r>
+              <w:rPr>
+                <w:rFonts w:ascii="AppleGothic" w:hAnsi="AppleGothic" w:eastAsia="AppleGothic" w:cs="AppleGothic"/>
+                <w:sz w:val="20"/>
+              </w:rPr>
+              <w:t>사용자가 Privacy 설정에서 실행 중인 일반 앱 목록을 기준으로 추가 또는 삭제</w:t>
+            </w:r>
+          </w:p>
+        </w:tc>
+      </w:tr>
+    </w:tbl>
+    <w:p>
+      <w:pPr>
+        <w:spacing w:after="80"/>
+      </w:pPr>
+    </w:p>
+    <w:p>
+      <w:pPr>
+        <w:pStyle w:val="Heading3"/>
+        <w:spacing w:before="320" w:after="80"/>
+      </w:pPr>
+      <w:r>
+        <w:rPr>
+          <w:rFonts w:ascii="AppleGothic" w:hAnsi="AppleGothic" w:eastAsia="AppleGothic" w:cs="AppleGothic"/>
+          <w:b w:val="0"/>
+          <w:color w:val="434343"/>
+          <w:sz w:val="28"/>
+        </w:rPr>
+        <w:t>동작 원칙</w:t>
       </w:r>
     </w:p>
     <w:p>
@@ -1653,7 +2425,7 @@
           <w:rFonts w:ascii="AppleGothic" w:hAnsi="AppleGothic" w:eastAsia="AppleGothic" w:cs="AppleGothic"/>
           <w:sz w:val="22"/>
         </w:rPr>
-        <w:t>모든 일반 앱 창을 대상으로 한다.</w:t>
+        <w:t>Flick Privacy 실행 시 켜져 있는 세부 기능만 순차 실행한다.</w:t>
       </w:r>
     </w:p>
     <w:p>
@@ -1666,7 +2438,33 @@
           <w:rFonts w:ascii="AppleGothic" w:hAnsi="AppleGothic" w:eastAsia="AppleGothic" w:cs="AppleGothic"/>
           <w:sz w:val="22"/>
         </w:rPr>
-        <w:t>현재 활성 창은 유지한다.</w:t>
+        <w:t>한 단계가 실패해도 전체 실행을 중단하지 않고 가능한 나머지 단계를 계속 실행한다.</w:t>
+      </w:r>
+    </w:p>
+    <w:p>
+      <w:pPr>
+        <w:pStyle w:val="ListBullet"/>
+        <w:spacing w:after="80" w:line="276" w:lineRule="auto"/>
+      </w:pPr>
+      <w:r>
+        <w:rPr>
+          <w:rFonts w:ascii="AppleGothic" w:hAnsi="AppleGothic" w:eastAsia="AppleGothic" w:cs="AppleGothic"/>
+          <w:sz w:val="22"/>
+        </w:rPr>
+        <w:t>실행 결과는 최근 활동 로그 또는 상태 메시지에 요약한다.</w:t>
+      </w:r>
+    </w:p>
+    <w:p>
+      <w:pPr>
+        <w:pStyle w:val="ListBullet"/>
+        <w:spacing w:after="80" w:line="276" w:lineRule="auto"/>
+      </w:pPr>
+      <w:r>
+        <w:rPr>
+          <w:rFonts w:ascii="AppleGothic" w:hAnsi="AppleGothic" w:eastAsia="AppleGothic" w:cs="AppleGothic"/>
+          <w:sz w:val="22"/>
+        </w:rPr>
+        <w:t>밝기, 업무 모드, 미디어 일시정지처럼 환경에 따라 실패할 수 있는 기능은 독립적으로 실패 처리한다.</w:t>
       </w:r>
     </w:p>
     <w:p>
@@ -1681,7 +2479,7 @@
           <w:color w:val="434343"/>
           <w:sz w:val="28"/>
         </w:rPr>
-        <w:t>제외 범위</w:t>
+        <w:t>구현 제약</w:t>
       </w:r>
     </w:p>
     <w:p>
@@ -1694,7 +2492,7 @@
           <w:rFonts w:ascii="AppleGothic" w:hAnsi="AppleGothic" w:eastAsia="AppleGothic" w:cs="AppleGothic"/>
           <w:sz w:val="22"/>
         </w:rPr>
-        <w:t>macOS 메뉴바, Dock, 시스템 UI는 제어 대상에서 제외한다.</w:t>
+        <w:t>밝기는 현재 밝기의 30%가 아니라 전체 밝기 스케일 기준 기본 30%로 설정한다.</w:t>
       </w:r>
     </w:p>
     <w:p>
@@ -1707,22 +2505,7 @@
           <w:rFonts w:ascii="AppleGothic" w:hAnsi="AppleGothic" w:eastAsia="AppleGothic" w:cs="AppleGothic"/>
           <w:sz w:val="22"/>
         </w:rPr>
-        <w:t>초기 버전에서는 Focus ON/OFF 토글을 필수 범위로 보지 않는다.</w:t>
-      </w:r>
-    </w:p>
-    <w:p>
-      <w:pPr>
-        <w:pStyle w:val="Heading3"/>
-        <w:spacing w:before="320" w:after="80"/>
-      </w:pPr>
-      <w:r>
-        <w:rPr>
-          <w:rFonts w:ascii="AppleGothic" w:hAnsi="AppleGothic" w:eastAsia="AppleGothic" w:cs="AppleGothic"/>
-          <w:b w:val="0"/>
-          <w:color w:val="434343"/>
-          <w:sz w:val="28"/>
-        </w:rPr>
-        <w:t>구현 후보</w:t>
+        <w:t>업무 모드 전환은 macOS Focus / Do Not Disturb / Shortcuts / AppleScript 등 가능한 방식으로 검토하되, OS 권한과 버전에 따라 동작이 제한될 수 있다.</w:t>
       </w:r>
     </w:p>
     <w:p>
@@ -1735,7 +2518,7 @@
           <w:rFonts w:ascii="AppleGothic" w:hAnsi="AppleGothic" w:eastAsia="AppleGothic" w:cs="AppleGothic"/>
           <w:sz w:val="22"/>
         </w:rPr>
-        <w:t>NSApplication.hide() 기반으로 앱 단위 숨김을 수행한다.</w:t>
+        <w:t>미디어 일시정지는 재생 중인 앱과 콘텐츠를 완벽히 식별하는 기능이 아니라, 시스템 미디어 Pause 명령을 보내는 방식으로 정의한다.</w:t>
       </w:r>
     </w:p>
     <w:p>
@@ -1748,7 +2531,7 @@
           <w:rFonts w:ascii="AppleGothic" w:hAnsi="AppleGothic" w:eastAsia="AppleGothic" w:cs="AppleGothic"/>
           <w:sz w:val="22"/>
         </w:rPr>
-        <w:t>필요 시 AXUIElement 기반으로 창 단위 제어를 검토한다.</w:t>
+        <w:t>현재 창 외 나머지 숨김은 기존 Flick Focus 기능을 그대로 재사용한다.</w:t>
       </w:r>
     </w:p>
     <w:p>
@@ -1776,7 +2559,7 @@
           <w:rFonts w:ascii="AppleGothic" w:hAnsi="AppleGothic" w:eastAsia="AppleGothic" w:cs="AppleGothic"/>
           <w:sz w:val="22"/>
         </w:rPr>
-        <w:t>Close 제스처가 인식되면 현재 활성 창만 화면에 남는다.</w:t>
+        <w:t>Close 제스처가 인식되면 Flick Privacy가 실행된다.</w:t>
       </w:r>
     </w:p>
     <w:p>
@@ -1789,7 +2572,7 @@
           <w:rFonts w:ascii="AppleGothic" w:hAnsi="AppleGothic" w:eastAsia="AppleGothic" w:cs="AppleGothic"/>
           <w:sz w:val="22"/>
         </w:rPr>
-        <w:t>비활성 일반 앱 창은 Hide 상태로 전환된다.</w:t>
+        <w:t>각 세부 기능은 앱 UI에서 독립적으로 on/off 할 수 있다.</w:t>
       </w:r>
     </w:p>
     <w:p>
@@ -1802,7 +2585,7 @@
           <w:rFonts w:ascii="AppleGothic" w:hAnsi="AppleGothic" w:eastAsia="AppleGothic" w:cs="AppleGothic"/>
           <w:sz w:val="22"/>
         </w:rPr>
-        <w:t>메뉴바, Dock, 시스템 UI는 기능 실행 후에도 정상적으로 유지된다.</w:t>
+        <w:t>밝기 기능이 켜져 있으면 내장 디스플레이 밝기가 기본 30% 또는 사용자가 설정한 값으로 조정된다.</w:t>
       </w:r>
     </w:p>
     <w:p>
@@ -1815,7 +2598,59 @@
           <w:rFonts w:ascii="AppleGothic" w:hAnsi="AppleGothic" w:eastAsia="AppleGothic" w:cs="AppleGothic"/>
           <w:sz w:val="22"/>
         </w:rPr>
-        <w:t>초기 버전에서는 같은 제스처를 반복 실행해도 오류나 창 상태 깨짐이 없어야 한다.</w:t>
+        <w:t>볼륨 기능이 켜져 있으면 시스템 볼륨이 0%가 된다.</w:t>
+      </w:r>
+    </w:p>
+    <w:p>
+      <w:pPr>
+        <w:pStyle w:val="ListNumber"/>
+        <w:spacing w:after="80" w:line="276" w:lineRule="auto"/>
+      </w:pPr>
+      <w:r>
+        <w:rPr>
+          <w:rFonts w:ascii="AppleGothic" w:hAnsi="AppleGothic" w:eastAsia="AppleGothic" w:cs="AppleGothic"/>
+          <w:sz w:val="22"/>
+        </w:rPr>
+        <w:t>메신저/메일 숨김 기능이 켜져 있으면 기본 대상 앱과 사용자 지정 앱이 화면에서 숨겨진다.</w:t>
+      </w:r>
+    </w:p>
+    <w:p>
+      <w:pPr>
+        <w:pStyle w:val="ListNumber"/>
+        <w:spacing w:after="80" w:line="276" w:lineRule="auto"/>
+      </w:pPr>
+      <w:r>
+        <w:rPr>
+          <w:rFonts w:ascii="AppleGothic" w:hAnsi="AppleGothic" w:eastAsia="AppleGothic" w:cs="AppleGothic"/>
+          <w:sz w:val="22"/>
+        </w:rPr>
+        <w:t>업무 모드 기능이 켜져 있으면 가능한 방식으로 업무 모드 전환을 시도하고, 실패 시 사용자에게 제한을 안내한다.</w:t>
+      </w:r>
+    </w:p>
+    <w:p>
+      <w:pPr>
+        <w:pStyle w:val="ListNumber"/>
+        <w:spacing w:after="80" w:line="276" w:lineRule="auto"/>
+      </w:pPr>
+      <w:r>
+        <w:rPr>
+          <w:rFonts w:ascii="AppleGothic" w:hAnsi="AppleGothic" w:eastAsia="AppleGothic" w:cs="AppleGothic"/>
+          <w:sz w:val="22"/>
+        </w:rPr>
+        <w:t>미디어 기능이 켜져 있으면 현재 시스템 미디어 재생에 Pause 명령을 보낸다.</w:t>
+      </w:r>
+    </w:p>
+    <w:p>
+      <w:pPr>
+        <w:pStyle w:val="ListNumber"/>
+        <w:spacing w:after="80" w:line="276" w:lineRule="auto"/>
+      </w:pPr>
+      <w:r>
+        <w:rPr>
+          <w:rFonts w:ascii="AppleGothic" w:hAnsi="AppleGothic" w:eastAsia="AppleGothic" w:cs="AppleGothic"/>
+          <w:sz w:val="22"/>
+        </w:rPr>
+        <w:t>창 숨김 기능이 켜져 있으면 활성 창을 유지하고 나머지 일반 앱 창은 숨긴다.</w:t>
       </w:r>
     </w:p>
     <w:p>
@@ -1830,7 +2665,7 @@
           <w:color w:val="000000"/>
           <w:sz w:val="32"/>
         </w:rPr>
-        <w:t>6.3 Flick Hide</w:t>
+        <w:t>6.3 Flick Privacy Cancel</w:t>
       </w:r>
     </w:p>
     <w:tbl>
@@ -1925,7 +2760,7 @@
                 <w:rFonts w:ascii="AppleGothic" w:hAnsi="AppleGothic" w:eastAsia="AppleGothic" w:cs="AppleGothic"/>
                 <w:sz w:val="20"/>
               </w:rPr>
-              <w:t>Close</w:t>
+              <w:t>Open 기본 할당</w:t>
             </w:r>
           </w:p>
         </w:tc>
@@ -1963,7 +2798,7 @@
                 <w:rFonts w:ascii="AppleGothic" w:hAnsi="AppleGothic" w:eastAsia="AppleGothic" w:cs="AppleGothic"/>
                 <w:sz w:val="20"/>
               </w:rPr>
-              <w:t>사용자가 바탕화면 파일에 즉시 접근할 수 있도록 Desktop 보기 상태를 만든다.</w:t>
+              <w:t>Flick Privacy 실행 이전의 작업 환경을 가능한 한 정확히 복구한다.</w:t>
             </w:r>
           </w:p>
         </w:tc>
@@ -2001,7 +2836,7 @@
                 <w:rFonts w:ascii="AppleGothic" w:hAnsi="AppleGothic" w:eastAsia="AppleGothic" w:cs="AppleGothic"/>
                 <w:sz w:val="20"/>
               </w:rPr>
-              <w:t>모든 일반 앱 창을 숨긴다.</w:t>
+              <w:t>Flick Privacy 실행 직전에 저장한 밝기, 볼륨, 업무 모드, 숨김 앱, 활성 앱/창 상태를 기준으로 복구를 시도한다.</w:t>
             </w:r>
           </w:p>
         </w:tc>
@@ -2021,7 +2856,7 @@
                 <w:rFonts w:ascii="AppleGothic" w:hAnsi="AppleGothic" w:eastAsia="AppleGothic" w:cs="AppleGothic"/>
                 <w:sz w:val="20"/>
               </w:rPr>
-              <w:t>실행 전 예시</w:t>
+              <w:t>UI 정책</w:t>
             </w:r>
           </w:p>
         </w:tc>
@@ -2039,7 +2874,7 @@
                 <w:rFonts w:ascii="AppleGothic" w:hAnsi="AppleGothic" w:eastAsia="AppleGothic" w:cs="AppleGothic"/>
                 <w:sz w:val="20"/>
               </w:rPr>
-              <w:t>Chrome, VSCode, Discord, Finder</w:t>
+              <w:t>Close에 Flick Privacy가 할당되면 Open에는 기본적으로 Flick Privacy Cancel을 자동 할당한다.</w:t>
             </w:r>
           </w:p>
         </w:tc>
@@ -2059,7 +2894,7 @@
                 <w:rFonts w:ascii="AppleGothic" w:hAnsi="AppleGothic" w:eastAsia="AppleGothic" w:cs="AppleGothic"/>
                 <w:sz w:val="20"/>
               </w:rPr>
-              <w:t>실행 후 예시</w:t>
+              <w:t>사용자 수정</w:t>
             </w:r>
           </w:p>
         </w:tc>
@@ -2077,7 +2912,7 @@
                 <w:rFonts w:ascii="AppleGothic" w:hAnsi="AppleGothic" w:eastAsia="AppleGothic" w:cs="AppleGothic"/>
                 <w:sz w:val="20"/>
               </w:rPr>
-              <w:t>Desktop만 표시한다.</w:t>
+              <w:t>사용자는 Open에 할당된 Flick Privacy Cancel을 다른 기능으로 자유롭게 변경할 수 있다.</w:t>
             </w:r>
           </w:p>
         </w:tc>
@@ -2100,7 +2935,7 @@
           <w:color w:val="434343"/>
           <w:sz w:val="28"/>
         </w:rPr>
-        <w:t>Flick Focus와의 차이</w:t>
+        <w:t>복구 대상</w:t>
       </w:r>
     </w:p>
     <w:tbl>
@@ -2124,7 +2959,7 @@
       <w:tr>
         <w:tc>
           <w:tcPr>
-            <w:tcW w:type="dxa" w:w="2200"/>
+            <w:tcW w:type="dxa" w:w="1900"/>
             <w:vAlign w:val="center"/>
             <w:shd w:fill="F8F9FA"/>
           </w:tcPr>
@@ -2138,13 +2973,13 @@
                 <w:b/>
                 <w:sz w:val="20"/>
               </w:rPr>
-              <w:t>기능</w:t>
+              <w:t>복구 항목</w:t>
             </w:r>
           </w:p>
         </w:tc>
         <w:tc>
           <w:tcPr>
-            <w:tcW w:type="dxa" w:w="2600"/>
+            <w:tcW w:type="dxa" w:w="3300"/>
             <w:vAlign w:val="center"/>
             <w:shd w:fill="F8F9FA"/>
           </w:tcPr>
@@ -2158,13 +2993,13 @@
                 <w:b/>
                 <w:sz w:val="20"/>
               </w:rPr>
-              <w:t>남기는 창</w:t>
+              <w:t>복구 기준</w:t>
             </w:r>
           </w:p>
         </w:tc>
         <w:tc>
           <w:tcPr>
-            <w:tcW w:type="dxa" w:w="4560"/>
+            <w:tcW w:type="dxa" w:w="4160"/>
             <w:vAlign w:val="center"/>
             <w:shd w:fill="F8F9FA"/>
           </w:tcPr>
@@ -2178,7 +3013,7 @@
                 <w:b/>
                 <w:sz w:val="20"/>
               </w:rPr>
-              <w:t>사용 맥락</w:t>
+              <w:t>제약</w:t>
             </w:r>
           </w:p>
         </w:tc>
@@ -2186,7 +3021,7 @@
       <w:tr>
         <w:tc>
           <w:tcPr>
-            <w:tcW w:type="dxa" w:w="2200"/>
+            <w:tcW w:type="dxa" w:w="1900"/>
             <w:vAlign w:val="center"/>
           </w:tcPr>
           <w:p>
@@ -2198,13 +3033,13 @@
                 <w:rFonts w:ascii="AppleGothic" w:hAnsi="AppleGothic" w:eastAsia="AppleGothic" w:cs="AppleGothic"/>
                 <w:sz w:val="20"/>
               </w:rPr>
-              <w:t>Flick Focus</w:t>
+              <w:t>밝기</w:t>
             </w:r>
           </w:p>
         </w:tc>
         <w:tc>
           <w:tcPr>
-            <w:tcW w:type="dxa" w:w="2600"/>
+            <w:tcW w:type="dxa" w:w="3300"/>
             <w:vAlign w:val="center"/>
           </w:tcPr>
           <w:p>
@@ -2216,13 +3051,13 @@
                 <w:rFonts w:ascii="AppleGothic" w:hAnsi="AppleGothic" w:eastAsia="AppleGothic" w:cs="AppleGothic"/>
                 <w:sz w:val="20"/>
               </w:rPr>
-              <w:t>활성 창 1개 유지</w:t>
+              <w:t>Privacy 실행 전 밝기 값으로 복구</w:t>
             </w:r>
           </w:p>
         </w:tc>
         <w:tc>
           <w:tcPr>
-            <w:tcW w:type="dxa" w:w="4560"/>
+            <w:tcW w:type="dxa" w:w="4160"/>
             <w:vAlign w:val="center"/>
           </w:tcPr>
           <w:p>
@@ -2234,7 +3069,7 @@
                 <w:rFonts w:ascii="AppleGothic" w:hAnsi="AppleGothic" w:eastAsia="AppleGothic" w:cs="AppleGothic"/>
                 <w:sz w:val="20"/>
               </w:rPr>
-              <w:t>현재 작업에 집중하고 싶을 때</w:t>
+              <w:t>디스플레이 제어 가능 환경에서만 보장</w:t>
             </w:r>
           </w:p>
         </w:tc>
@@ -2242,7 +3077,7 @@
       <w:tr>
         <w:tc>
           <w:tcPr>
-            <w:tcW w:type="dxa" w:w="2200"/>
+            <w:tcW w:type="dxa" w:w="1900"/>
             <w:vAlign w:val="center"/>
           </w:tcPr>
           <w:p>
@@ -2254,13 +3089,13 @@
                 <w:rFonts w:ascii="AppleGothic" w:hAnsi="AppleGothic" w:eastAsia="AppleGothic" w:cs="AppleGothic"/>
                 <w:sz w:val="20"/>
               </w:rPr>
-              <w:t>Flick Hide</w:t>
+              <w:t>볼륨</w:t>
             </w:r>
           </w:p>
         </w:tc>
         <w:tc>
           <w:tcPr>
-            <w:tcW w:type="dxa" w:w="2600"/>
+            <w:tcW w:type="dxa" w:w="3300"/>
             <w:vAlign w:val="center"/>
           </w:tcPr>
           <w:p>
@@ -2272,13 +3107,13 @@
                 <w:rFonts w:ascii="AppleGothic" w:hAnsi="AppleGothic" w:eastAsia="AppleGothic" w:cs="AppleGothic"/>
                 <w:sz w:val="20"/>
               </w:rPr>
-              <w:t>모든 창 숨김</w:t>
+              <w:t>Privacy 실행 전 볼륨 값으로 복구</w:t>
             </w:r>
           </w:p>
         </w:tc>
         <w:tc>
           <w:tcPr>
-            <w:tcW w:type="dxa" w:w="4560"/>
+            <w:tcW w:type="dxa" w:w="4160"/>
             <w:vAlign w:val="center"/>
           </w:tcPr>
           <w:p>
@@ -2290,7 +3125,231 @@
                 <w:rFonts w:ascii="AppleGothic" w:hAnsi="AppleGothic" w:eastAsia="AppleGothic" w:cs="AppleGothic"/>
                 <w:sz w:val="20"/>
               </w:rPr>
-              <w:t>Desktop 파일이나 바탕화면 접근이 필요할 때</w:t>
+              <w:t>시스템 볼륨 제어 가능 환경에서만 보장</w:t>
+            </w:r>
+          </w:p>
+        </w:tc>
+      </w:tr>
+      <w:tr>
+        <w:tc>
+          <w:tcPr>
+            <w:tcW w:type="dxa" w:w="1900"/>
+            <w:vAlign w:val="center"/>
+          </w:tcPr>
+          <w:p>
+            <w:pPr>
+              <w:spacing w:before="0" w:after="80"/>
+            </w:pPr>
+            <w:r>
+              <w:rPr>
+                <w:rFonts w:ascii="AppleGothic" w:hAnsi="AppleGothic" w:eastAsia="AppleGothic" w:cs="AppleGothic"/>
+                <w:sz w:val="20"/>
+              </w:rPr>
+              <w:t>메신저/메일 앱</w:t>
+            </w:r>
+          </w:p>
+        </w:tc>
+        <w:tc>
+          <w:tcPr>
+            <w:tcW w:type="dxa" w:w="3300"/>
+            <w:vAlign w:val="center"/>
+          </w:tcPr>
+          <w:p>
+            <w:pPr>
+              <w:spacing w:before="0" w:after="80"/>
+            </w:pPr>
+            <w:r>
+              <w:rPr>
+                <w:rFonts w:ascii="AppleGothic" w:hAnsi="AppleGothic" w:eastAsia="AppleGothic" w:cs="AppleGothic"/>
+                <w:sz w:val="20"/>
+              </w:rPr>
+              <w:t>Privacy가 숨긴 앱을 다시 표시 또는 활성화 시도</w:t>
+            </w:r>
+          </w:p>
+        </w:tc>
+        <w:tc>
+          <w:tcPr>
+            <w:tcW w:type="dxa" w:w="4160"/>
+            <w:vAlign w:val="center"/>
+          </w:tcPr>
+          <w:p>
+            <w:pPr>
+              <w:spacing w:before="0" w:after="80"/>
+            </w:pPr>
+            <w:r>
+              <w:rPr>
+                <w:rFonts w:ascii="AppleGothic" w:hAnsi="AppleGothic" w:eastAsia="AppleGothic" w:cs="AppleGothic"/>
+                <w:sz w:val="20"/>
+              </w:rPr>
+              <w:t>앱 종료, 권한, Space 상태에 따라 완전 복구가 제한될 수 있음</w:t>
+            </w:r>
+          </w:p>
+        </w:tc>
+      </w:tr>
+      <w:tr>
+        <w:tc>
+          <w:tcPr>
+            <w:tcW w:type="dxa" w:w="1900"/>
+            <w:vAlign w:val="center"/>
+          </w:tcPr>
+          <w:p>
+            <w:pPr>
+              <w:spacing w:before="0" w:after="80"/>
+            </w:pPr>
+            <w:r>
+              <w:rPr>
+                <w:rFonts w:ascii="AppleGothic" w:hAnsi="AppleGothic" w:eastAsia="AppleGothic" w:cs="AppleGothic"/>
+                <w:sz w:val="20"/>
+              </w:rPr>
+              <w:t>업무 모드</w:t>
+            </w:r>
+          </w:p>
+        </w:tc>
+        <w:tc>
+          <w:tcPr>
+            <w:tcW w:type="dxa" w:w="3300"/>
+            <w:vAlign w:val="center"/>
+          </w:tcPr>
+          <w:p>
+            <w:pPr>
+              <w:spacing w:before="0" w:after="80"/>
+            </w:pPr>
+            <w:r>
+              <w:rPr>
+                <w:rFonts w:ascii="AppleGothic" w:hAnsi="AppleGothic" w:eastAsia="AppleGothic" w:cs="AppleGothic"/>
+                <w:sz w:val="20"/>
+              </w:rPr>
+              <w:t>Privacy 실행 전 업무 모드/Focus 상태로 복구 시도</w:t>
+            </w:r>
+          </w:p>
+        </w:tc>
+        <w:tc>
+          <w:tcPr>
+            <w:tcW w:type="dxa" w:w="4160"/>
+            <w:vAlign w:val="center"/>
+          </w:tcPr>
+          <w:p>
+            <w:pPr>
+              <w:spacing w:before="0" w:after="80"/>
+            </w:pPr>
+            <w:r>
+              <w:rPr>
+                <w:rFonts w:ascii="AppleGothic" w:hAnsi="AppleGothic" w:eastAsia="AppleGothic" w:cs="AppleGothic"/>
+                <w:sz w:val="20"/>
+              </w:rPr>
+              <w:t>macOS Focus 제어 방식과 권한에 따라 제한</w:t>
+            </w:r>
+          </w:p>
+        </w:tc>
+      </w:tr>
+      <w:tr>
+        <w:tc>
+          <w:tcPr>
+            <w:tcW w:type="dxa" w:w="1900"/>
+            <w:vAlign w:val="center"/>
+          </w:tcPr>
+          <w:p>
+            <w:pPr>
+              <w:spacing w:before="0" w:after="80"/>
+            </w:pPr>
+            <w:r>
+              <w:rPr>
+                <w:rFonts w:ascii="AppleGothic" w:hAnsi="AppleGothic" w:eastAsia="AppleGothic" w:cs="AppleGothic"/>
+                <w:sz w:val="20"/>
+              </w:rPr>
+              <w:t>미디어</w:t>
+            </w:r>
+          </w:p>
+        </w:tc>
+        <w:tc>
+          <w:tcPr>
+            <w:tcW w:type="dxa" w:w="3300"/>
+            <w:vAlign w:val="center"/>
+          </w:tcPr>
+          <w:p>
+            <w:pPr>
+              <w:spacing w:before="0" w:after="80"/>
+            </w:pPr>
+            <w:r>
+              <w:rPr>
+                <w:rFonts w:ascii="AppleGothic" w:hAnsi="AppleGothic" w:eastAsia="AppleGothic" w:cs="AppleGothic"/>
+                <w:sz w:val="20"/>
+              </w:rPr>
+              <w:t>Privacy가 Pause를 보낸 경우 이전 재생 상태 복구는 기본 범위에서 제외</w:t>
+            </w:r>
+          </w:p>
+        </w:tc>
+        <w:tc>
+          <w:tcPr>
+            <w:tcW w:type="dxa" w:w="4160"/>
+            <w:vAlign w:val="center"/>
+          </w:tcPr>
+          <w:p>
+            <w:pPr>
+              <w:spacing w:before="0" w:after="80"/>
+            </w:pPr>
+            <w:r>
+              <w:rPr>
+                <w:rFonts w:ascii="AppleGothic" w:hAnsi="AppleGothic" w:eastAsia="AppleGothic" w:cs="AppleGothic"/>
+                <w:sz w:val="20"/>
+              </w:rPr>
+              <w:t>어떤 콘텐츠가 재생 중이었는지 완전 식별하지 않음</w:t>
+            </w:r>
+          </w:p>
+        </w:tc>
+      </w:tr>
+      <w:tr>
+        <w:tc>
+          <w:tcPr>
+            <w:tcW w:type="dxa" w:w="1900"/>
+            <w:vAlign w:val="center"/>
+          </w:tcPr>
+          <w:p>
+            <w:pPr>
+              <w:spacing w:before="0" w:after="80"/>
+            </w:pPr>
+            <w:r>
+              <w:rPr>
+                <w:rFonts w:ascii="AppleGothic" w:hAnsi="AppleGothic" w:eastAsia="AppleGothic" w:cs="AppleGothic"/>
+                <w:sz w:val="20"/>
+              </w:rPr>
+              <w:t>창 표시 상태</w:t>
+            </w:r>
+          </w:p>
+        </w:tc>
+        <w:tc>
+          <w:tcPr>
+            <w:tcW w:type="dxa" w:w="3300"/>
+            <w:vAlign w:val="center"/>
+          </w:tcPr>
+          <w:p>
+            <w:pPr>
+              <w:spacing w:before="0" w:after="80"/>
+            </w:pPr>
+            <w:r>
+              <w:rPr>
+                <w:rFonts w:ascii="AppleGothic" w:hAnsi="AppleGothic" w:eastAsia="AppleGothic" w:cs="AppleGothic"/>
+                <w:sz w:val="20"/>
+              </w:rPr>
+              <w:t>Privacy 실행 전 활성 앱/창을 다시 활성화하고 가능한 창 상태 복구</w:t>
+            </w:r>
+          </w:p>
+        </w:tc>
+        <w:tc>
+          <w:tcPr>
+            <w:tcW w:type="dxa" w:w="4160"/>
+            <w:vAlign w:val="center"/>
+          </w:tcPr>
+          <w:p>
+            <w:pPr>
+              <w:spacing w:before="0" w:after="80"/>
+            </w:pPr>
+            <w:r>
+              <w:rPr>
+                <w:rFonts w:ascii="AppleGothic" w:hAnsi="AppleGothic" w:eastAsia="AppleGothic" w:cs="AppleGothic"/>
+                <w:sz w:val="20"/>
+              </w:rPr>
+              <w:t>숨김 해제와 활성화 중심, 모든 창 위치/Space 복원은 보장하지 않음</w:t>
             </w:r>
           </w:p>
         </w:tc>
@@ -2313,7 +3372,7 @@
           <w:color w:val="434343"/>
           <w:sz w:val="28"/>
         </w:rPr>
-        <w:t>구현 후보</w:t>
+        <w:t>상태 저장 원칙</w:t>
       </w:r>
     </w:p>
     <w:p>
@@ -2326,7 +3385,7 @@
           <w:rFonts w:ascii="AppleGothic" w:hAnsi="AppleGothic" w:eastAsia="AppleGothic" w:cs="AppleGothic"/>
           <w:sz w:val="22"/>
         </w:rPr>
-        <w:t>macOS Show Desktop 동작 호출을 검토한다.</w:t>
+        <w:t>Flick Privacy 실행 직전에 복구용 스냅샷을 저장한다.</w:t>
       </w:r>
     </w:p>
     <w:p>
@@ -2339,7 +3398,33 @@
           <w:rFonts w:ascii="AppleGothic" w:hAnsi="AppleGothic" w:eastAsia="AppleGothic" w:cs="AppleGothic"/>
           <w:sz w:val="22"/>
         </w:rPr>
-        <w:t>Mission Control 관련 API 또는 시스템 이벤트 기반 접근을 검토한다.</w:t>
+        <w:t>스냅샷에는 밝기, 볼륨, 업무 모드 상태, Privacy가 숨긴 앱 목록, Privacy 실행 전 활성 앱/창 정보를 포함한다.</w:t>
+      </w:r>
+    </w:p>
+    <w:p>
+      <w:pPr>
+        <w:pStyle w:val="ListBullet"/>
+        <w:spacing w:after="80" w:line="276" w:lineRule="auto"/>
+      </w:pPr>
+      <w:r>
+        <w:rPr>
+          <w:rFonts w:ascii="AppleGothic" w:hAnsi="AppleGothic" w:eastAsia="AppleGothic" w:cs="AppleGothic"/>
+          <w:sz w:val="22"/>
+        </w:rPr>
+        <w:t>Flick Privacy Cancel은 가장 최근 Flick Privacy 스냅샷이 있을 때만 의미 있게 동작한다.</w:t>
+      </w:r>
+    </w:p>
+    <w:p>
+      <w:pPr>
+        <w:pStyle w:val="ListBullet"/>
+        <w:spacing w:after="80" w:line="276" w:lineRule="auto"/>
+      </w:pPr>
+      <w:r>
+        <w:rPr>
+          <w:rFonts w:ascii="AppleGothic" w:hAnsi="AppleGothic" w:eastAsia="AppleGothic" w:cs="AppleGothic"/>
+          <w:sz w:val="22"/>
+        </w:rPr>
+        <w:t>스냅샷이 없거나 일부 항목을 복구할 수 없으면 가능한 항목만 복구하고 사용자에게 요약한다.</w:t>
       </w:r>
     </w:p>
     <w:p>
@@ -2367,7 +3452,7 @@
           <w:rFonts w:ascii="AppleGothic" w:hAnsi="AppleGothic" w:eastAsia="AppleGothic" w:cs="AppleGothic"/>
           <w:sz w:val="22"/>
         </w:rPr>
-        <w:t>Close 제스처가 인식되면 모든 일반 앱 창이 화면에서 사라진다.</w:t>
+        <w:t>Close에 Flick Privacy가 할당되면 Open에는 기본적으로 Flick Privacy Cancel이 자동 할당된다.</w:t>
       </w:r>
     </w:p>
     <w:p>
@@ -2380,7 +3465,7 @@
           <w:rFonts w:ascii="AppleGothic" w:hAnsi="AppleGothic" w:eastAsia="AppleGothic" w:cs="AppleGothic"/>
           <w:sz w:val="22"/>
         </w:rPr>
-        <w:t>Desktop 영역과 바탕화면 파일이 사용 가능해야 한다.</w:t>
+        <w:t>사용자는 Open의 기본 할당을 다른 기능으로 수정할 수 있다.</w:t>
       </w:r>
     </w:p>
     <w:p>
@@ -2393,7 +3478,46 @@
           <w:rFonts w:ascii="AppleGothic" w:hAnsi="AppleGothic" w:eastAsia="AppleGothic" w:cs="AppleGothic"/>
           <w:sz w:val="22"/>
         </w:rPr>
-        <w:t>메뉴바, Dock, 시스템 UI는 제어 대상에서 제외된다.</w:t>
+        <w:t>Open 제스처로 Flick Privacy Cancel이 실행되면 가장 최근 Privacy 실행 전 밝기와 볼륨으로 복구를 시도한다.</w:t>
+      </w:r>
+    </w:p>
+    <w:p>
+      <w:pPr>
+        <w:pStyle w:val="ListNumber"/>
+        <w:spacing w:after="80" w:line="276" w:lineRule="auto"/>
+      </w:pPr>
+      <w:r>
+        <w:rPr>
+          <w:rFonts w:ascii="AppleGothic" w:hAnsi="AppleGothic" w:eastAsia="AppleGothic" w:cs="AppleGothic"/>
+          <w:sz w:val="22"/>
+        </w:rPr>
+        <w:t>Privacy가 숨긴 앱은 가능한 범위에서 다시 표시 또는 활성화된다.</w:t>
+      </w:r>
+    </w:p>
+    <w:p>
+      <w:pPr>
+        <w:pStyle w:val="ListNumber"/>
+        <w:spacing w:after="80" w:line="276" w:lineRule="auto"/>
+      </w:pPr>
+      <w:r>
+        <w:rPr>
+          <w:rFonts w:ascii="AppleGothic" w:hAnsi="AppleGothic" w:eastAsia="AppleGothic" w:cs="AppleGothic"/>
+          <w:sz w:val="22"/>
+        </w:rPr>
+        <w:t>업무 모드는 가능한 범위에서 Privacy 실행 전 상태로 복구된다.</w:t>
+      </w:r>
+    </w:p>
+    <w:p>
+      <w:pPr>
+        <w:pStyle w:val="ListNumber"/>
+        <w:spacing w:after="80" w:line="276" w:lineRule="auto"/>
+      </w:pPr>
+      <w:r>
+        <w:rPr>
+          <w:rFonts w:ascii="AppleGothic" w:hAnsi="AppleGothic" w:eastAsia="AppleGothic" w:cs="AppleGothic"/>
+          <w:sz w:val="22"/>
+        </w:rPr>
+        <w:t>복구할 스냅샷이 없거나 일부 복구에 실패해도 앱이 크래시하지 않고 결과를 요약한다.</w:t>
       </w:r>
     </w:p>
     <w:p>
@@ -2420,7 +3544,7 @@
           <w:rFonts w:ascii="AppleGothic" w:hAnsi="AppleGothic" w:eastAsia="AppleGothic" w:cs="AppleGothic"/>
           <w:sz w:val="22"/>
         </w:rPr>
-        <w:t>MVP 확장 개발은 사용자 체감 가치와 구현 난이도를 기준으로 Flick Focus를 우선한다. Flick Hide는 구현 난이도는 낮지만 활용 빈도가 Focus보다 낮을 가능성이 있어 후순위로 둔다.</w:t>
+        <w:t>MVP 확장 개발은 Flick Privacy와 Flick Privacy Cancel의 한 쌍에 집중한다. Flick Privacy는 노트북 화면과 소리가 주변에 노출되는 실제 사용 맥락에서만 장점이 뚜렷하고, Flick Privacy Cancel은 사용자가 보호 모드에서 원래 작업 상태로 빠르게 돌아오게 만드는 복구 동작이다.</w:t>
       </w:r>
     </w:p>
     <w:tbl>
@@ -2631,7 +3755,7 @@
                 <w:rFonts w:ascii="AppleGothic" w:hAnsi="AppleGothic" w:eastAsia="AppleGothic" w:cs="AppleGothic"/>
                 <w:sz w:val="20"/>
               </w:rPr>
-              <w:t>Flick Focus</w:t>
+              <w:t>Flick Privacy</w:t>
             </w:r>
           </w:p>
         </w:tc>
@@ -2649,7 +3773,7 @@
                 <w:rFonts w:ascii="AppleGothic" w:hAnsi="AppleGothic" w:eastAsia="AppleGothic" w:cs="AppleGothic"/>
                 <w:sz w:val="20"/>
               </w:rPr>
-              <w:t>실사용 가치가 가장 높고 구현 난이도가 상대적으로 낮음</w:t>
+              <w:t>노트북 환경에서만 장점이 뚜렷하고 데모 가치가 높음</w:t>
             </w:r>
           </w:p>
         </w:tc>
@@ -2667,7 +3791,7 @@
                 <w:rFonts w:ascii="AppleGothic" w:hAnsi="AppleGothic" w:eastAsia="AppleGothic" w:cs="AppleGothic"/>
                 <w:sz w:val="20"/>
               </w:rPr>
-              <w:t>P1로 우선 구현</w:t>
+              <w:t>P1 신규 확정 기능으로 구현</w:t>
             </w:r>
           </w:p>
         </w:tc>
@@ -2705,7 +3829,7 @@
                 <w:rFonts w:ascii="AppleGothic" w:hAnsi="AppleGothic" w:eastAsia="AppleGothic" w:cs="AppleGothic"/>
                 <w:sz w:val="20"/>
               </w:rPr>
-              <w:t>Flick Hide</w:t>
+              <w:t>Flick Privacy Cancel</w:t>
             </w:r>
           </w:p>
         </w:tc>
@@ -2723,7 +3847,7 @@
                 <w:rFonts w:ascii="AppleGothic" w:hAnsi="AppleGothic" w:eastAsia="AppleGothic" w:cs="AppleGothic"/>
                 <w:sz w:val="20"/>
               </w:rPr>
-              <w:t>구현은 쉽지만 Focus 대비 사용 빈도는 낮을 가능성</w:t>
+              <w:t>Privacy 적용 이후 원복 경험을 완성하는 필수 보조 기능</w:t>
             </w:r>
           </w:p>
         </w:tc>
@@ -2741,7 +3865,81 @@
                 <w:rFonts w:ascii="AppleGothic" w:hAnsi="AppleGothic" w:eastAsia="AppleGothic" w:cs="AppleGothic"/>
                 <w:sz w:val="20"/>
               </w:rPr>
-              <w:t>P2로 구현 또는 데모용 후보 유지</w:t>
+              <w:t>Open 기본 할당으로 구현</w:t>
+            </w:r>
+          </w:p>
+        </w:tc>
+      </w:tr>
+      <w:tr>
+        <w:tc>
+          <w:tcPr>
+            <w:tcW w:type="dxa" w:w="900"/>
+            <w:vAlign w:val="center"/>
+          </w:tcPr>
+          <w:p>
+            <w:pPr>
+              <w:spacing w:before="0" w:after="80"/>
+            </w:pPr>
+            <w:r>
+              <w:rPr>
+                <w:rFonts w:ascii="AppleGothic" w:hAnsi="AppleGothic" w:eastAsia="AppleGothic" w:cs="AppleGothic"/>
+                <w:sz w:val="20"/>
+              </w:rPr>
+              <w:t>4</w:t>
+            </w:r>
+          </w:p>
+        </w:tc>
+        <w:tc>
+          <w:tcPr>
+            <w:tcW w:type="dxa" w:w="1800"/>
+            <w:vAlign w:val="center"/>
+          </w:tcPr>
+          <w:p>
+            <w:pPr>
+              <w:spacing w:before="0" w:after="80"/>
+            </w:pPr>
+            <w:r>
+              <w:rPr>
+                <w:rFonts w:ascii="AppleGothic" w:hAnsi="AppleGothic" w:eastAsia="AppleGothic" w:cs="AppleGothic"/>
+                <w:sz w:val="20"/>
+              </w:rPr>
+              <w:t>Flick Focus</w:t>
+            </w:r>
+          </w:p>
+        </w:tc>
+        <w:tc>
+          <w:tcPr>
+            <w:tcW w:type="dxa" w:w="4560"/>
+            <w:vAlign w:val="center"/>
+          </w:tcPr>
+          <w:p>
+            <w:pPr>
+              <w:spacing w:before="0" w:after="80"/>
+            </w:pPr>
+            <w:r>
+              <w:rPr>
+                <w:rFonts w:ascii="AppleGothic" w:hAnsi="AppleGothic" w:eastAsia="AppleGothic" w:cs="AppleGothic"/>
+                <w:sz w:val="20"/>
+              </w:rPr>
+              <w:t>Privacy의 현재 창 유지/나머지 숨김 세부 기능으로 재사용</w:t>
+            </w:r>
+          </w:p>
+        </w:tc>
+        <w:tc>
+          <w:tcPr>
+            <w:tcW w:type="dxa" w:w="2100"/>
+            <w:vAlign w:val="center"/>
+          </w:tcPr>
+          <w:p>
+            <w:pPr>
+              <w:spacing w:before="0" w:after="80"/>
+            </w:pPr>
+            <w:r>
+              <w:rPr>
+                <w:rFonts w:ascii="AppleGothic" w:hAnsi="AppleGothic" w:eastAsia="AppleGothic" w:cs="AppleGothic"/>
+                <w:sz w:val="20"/>
+              </w:rPr>
+              <w:t>독립 기능보다 내부 로직으로 우선 활용</w:t>
             </w:r>
           </w:p>
         </w:tc>
@@ -2792,7 +3990,33 @@
           <w:rFonts w:ascii="AppleGothic" w:hAnsi="AppleGothic" w:eastAsia="AppleGothic" w:cs="AppleGothic"/>
           <w:sz w:val="22"/>
         </w:rPr>
-        <w:t>Close 제스처를 이용한 Flick Arrange, Flick Focus, Flick Hide 실행</w:t>
+        <w:t>Close 제스처를 이용한 Flick Arrange 및 Flick Privacy 실행</w:t>
+      </w:r>
+    </w:p>
+    <w:p>
+      <w:pPr>
+        <w:pStyle w:val="ListBullet"/>
+        <w:spacing w:after="80" w:line="276" w:lineRule="auto"/>
+      </w:pPr>
+      <w:r>
+        <w:rPr>
+          <w:rFonts w:ascii="AppleGothic" w:hAnsi="AppleGothic" w:eastAsia="AppleGothic" w:cs="AppleGothic"/>
+          <w:sz w:val="22"/>
+        </w:rPr>
+        <w:t>Close에 Flick Privacy 할당 시 Open에 Flick Privacy Cancel 기본 자동 할당</w:t>
+      </w:r>
+    </w:p>
+    <w:p>
+      <w:pPr>
+        <w:pStyle w:val="ListBullet"/>
+        <w:spacing w:after="80" w:line="276" w:lineRule="auto"/>
+      </w:pPr>
+      <w:r>
+        <w:rPr>
+          <w:rFonts w:ascii="AppleGothic" w:hAnsi="AppleGothic" w:eastAsia="AppleGothic" w:cs="AppleGothic"/>
+          <w:sz w:val="22"/>
+        </w:rPr>
+        <w:t>Open의 기본 할당을 사용자가 자유롭게 다른 기능으로 수정할 수 있는 인터페이스</w:t>
       </w:r>
     </w:p>
     <w:p>
@@ -2831,7 +4055,59 @@
           <w:rFonts w:ascii="AppleGothic" w:hAnsi="AppleGothic" w:eastAsia="AppleGothic" w:cs="AppleGothic"/>
           <w:sz w:val="22"/>
         </w:rPr>
-        <w:t>일반 앱 창 대상 Hide 또는 유지 동작</w:t>
+        <w:t>Flick Privacy 세부 기능별 on/off 설정</w:t>
+      </w:r>
+    </w:p>
+    <w:p>
+      <w:pPr>
+        <w:pStyle w:val="ListBullet"/>
+        <w:spacing w:after="80" w:line="276" w:lineRule="auto"/>
+      </w:pPr>
+      <w:r>
+        <w:rPr>
+          <w:rFonts w:ascii="AppleGothic" w:hAnsi="AppleGothic" w:eastAsia="AppleGothic" w:cs="AppleGothic"/>
+          <w:sz w:val="22"/>
+        </w:rPr>
+        <w:t>Flick Privacy 실행 전 상태 스냅샷 저장 및 Cancel 복구</w:t>
+      </w:r>
+    </w:p>
+    <w:p>
+      <w:pPr>
+        <w:pStyle w:val="ListBullet"/>
+        <w:spacing w:after="80" w:line="276" w:lineRule="auto"/>
+      </w:pPr>
+      <w:r>
+        <w:rPr>
+          <w:rFonts w:ascii="AppleGothic" w:hAnsi="AppleGothic" w:eastAsia="AppleGothic" w:cs="AppleGothic"/>
+          <w:sz w:val="22"/>
+        </w:rPr>
+        <w:t>밝기 목표값 0~100% 슬라이더와 기본 30% 설정</w:t>
+      </w:r>
+    </w:p>
+    <w:p>
+      <w:pPr>
+        <w:pStyle w:val="ListBullet"/>
+        <w:spacing w:after="80" w:line="276" w:lineRule="auto"/>
+      </w:pPr>
+      <w:r>
+        <w:rPr>
+          <w:rFonts w:ascii="AppleGothic" w:hAnsi="AppleGothic" w:eastAsia="AppleGothic" w:cs="AppleGothic"/>
+          <w:sz w:val="22"/>
+        </w:rPr>
+        <w:t>메신저/메일 기본 숨김 앱 목록 및 사용자 추가/삭제 목록</w:t>
+      </w:r>
+    </w:p>
+    <w:p>
+      <w:pPr>
+        <w:pStyle w:val="ListBullet"/>
+        <w:spacing w:after="80" w:line="276" w:lineRule="auto"/>
+      </w:pPr>
+      <w:r>
+        <w:rPr>
+          <w:rFonts w:ascii="AppleGothic" w:hAnsi="AppleGothic" w:eastAsia="AppleGothic" w:cs="AppleGothic"/>
+          <w:sz w:val="22"/>
+        </w:rPr>
+        <w:t>Flick Focus 로직 재사용을 통한 현재 창 외 나머지 숨김</w:t>
       </w:r>
     </w:p>
     <w:p>
@@ -2872,7 +4148,7 @@
           <w:rFonts w:ascii="AppleGothic" w:hAnsi="AppleGothic" w:eastAsia="AppleGothic" w:cs="AppleGothic"/>
           <w:sz w:val="22"/>
         </w:rPr>
-        <w:t>Flick Focus 토글 모드</w:t>
+        <w:t>Flick Focus 및 Flick Hide의 독립 신규 기능화</w:t>
       </w:r>
     </w:p>
     <w:p>
@@ -2899,6 +4175,32 @@
           <w:sz w:val="22"/>
         </w:rPr>
         <w:t>고급 창 관리 앱 수준의 레이아웃 커스터마이징</w:t>
+      </w:r>
+    </w:p>
+    <w:p>
+      <w:pPr>
+        <w:pStyle w:val="ListBullet"/>
+        <w:spacing w:after="80" w:line="276" w:lineRule="auto"/>
+      </w:pPr>
+      <w:r>
+        <w:rPr>
+          <w:rFonts w:ascii="AppleGothic" w:hAnsi="AppleGothic" w:eastAsia="AppleGothic" w:cs="AppleGothic"/>
+          <w:sz w:val="22"/>
+        </w:rPr>
+        <w:t>재생 중인 미디어 앱/콘텐츠의 완전한 자동 식별</w:t>
+      </w:r>
+    </w:p>
+    <w:p>
+      <w:pPr>
+        <w:pStyle w:val="ListBullet"/>
+        <w:spacing w:after="80" w:line="276" w:lineRule="auto"/>
+      </w:pPr>
+      <w:r>
+        <w:rPr>
+          <w:rFonts w:ascii="AppleGothic" w:hAnsi="AppleGothic" w:eastAsia="AppleGothic" w:cs="AppleGothic"/>
+          <w:sz w:val="22"/>
+        </w:rPr>
+        <w:t>모든 메신저 앱의 의미론적 자동 분류</w:t>
       </w:r>
     </w:p>
     <w:p>
@@ -2951,7 +4253,7 @@
           <w:rFonts w:ascii="AppleGothic" w:hAnsi="AppleGothic" w:eastAsia="AppleGothic" w:cs="AppleGothic"/>
           <w:sz w:val="22"/>
         </w:rPr>
-        <w:t>Close 제스처로 Flick Arrange를 실행해 창 정리 효과를 보여준다.</w:t>
+        <w:t>카페나 회의실처럼 주변 노출이 있는 노트북 작업 상황을 준비한다.</w:t>
       </w:r>
     </w:p>
     <w:p>
@@ -2964,7 +4266,7 @@
           <w:rFonts w:ascii="AppleGothic" w:hAnsi="AppleGothic" w:eastAsia="AppleGothic" w:cs="AppleGothic"/>
           <w:sz w:val="22"/>
         </w:rPr>
-        <w:t>VSCode 등 작업 중인 창을 활성화한 뒤 Close 제스처로 Flick Focus를 실행한다.</w:t>
+        <w:t>메신저, 메일, 브라우저, 작업 앱, 미디어 재생 상태를 함께 열어둔다.</w:t>
       </w:r>
     </w:p>
     <w:p>
@@ -2977,7 +4279,7 @@
           <w:rFonts w:ascii="AppleGothic" w:hAnsi="AppleGothic" w:eastAsia="AppleGothic" w:cs="AppleGothic"/>
           <w:sz w:val="22"/>
         </w:rPr>
-        <w:t>활성 창만 남고 나머지 앱이 숨겨지는지 확인한다.</w:t>
+        <w:t>Flick Privacy 설정에서 6개 세부 기능이 켜져 있는지 확인한다.</w:t>
       </w:r>
     </w:p>
     <w:p>
@@ -2990,7 +4292,46 @@
           <w:rFonts w:ascii="AppleGothic" w:hAnsi="AppleGothic" w:eastAsia="AppleGothic" w:cs="AppleGothic"/>
           <w:sz w:val="22"/>
         </w:rPr>
-        <w:t>Flick Hide 구현 이후에는 Close 제스처로 Desktop만 표시되는 시나리오를 추가한다.</w:t>
+        <w:t>Close 제스처로 Flick Privacy를 실행한다.</w:t>
+      </w:r>
+    </w:p>
+    <w:p>
+      <w:pPr>
+        <w:pStyle w:val="ListNumber"/>
+        <w:spacing w:after="80" w:line="276" w:lineRule="auto"/>
+      </w:pPr>
+      <w:r>
+        <w:rPr>
+          <w:rFonts w:ascii="AppleGothic" w:hAnsi="AppleGothic" w:eastAsia="AppleGothic" w:cs="AppleGothic"/>
+          <w:sz w:val="22"/>
+        </w:rPr>
+        <w:t>화면 밝기, 볼륨, 민감 앱 숨김, 업무 모드, 미디어 일시정지, 활성 창 유지 상태를 확인한다.</w:t>
+      </w:r>
+    </w:p>
+    <w:p>
+      <w:pPr>
+        <w:pStyle w:val="ListNumber"/>
+        <w:spacing w:after="80" w:line="276" w:lineRule="auto"/>
+      </w:pPr>
+      <w:r>
+        <w:rPr>
+          <w:rFonts w:ascii="AppleGothic" w:hAnsi="AppleGothic" w:eastAsia="AppleGothic" w:cs="AppleGothic"/>
+          <w:sz w:val="22"/>
+        </w:rPr>
+        <w:t>Open 제스처로 Flick Privacy Cancel을 실행한다.</w:t>
+      </w:r>
+    </w:p>
+    <w:p>
+      <w:pPr>
+        <w:pStyle w:val="ListNumber"/>
+        <w:spacing w:after="80" w:line="276" w:lineRule="auto"/>
+      </w:pPr>
+      <w:r>
+        <w:rPr>
+          <w:rFonts w:ascii="AppleGothic" w:hAnsi="AppleGothic" w:eastAsia="AppleGothic" w:cs="AppleGothic"/>
+          <w:sz w:val="22"/>
+        </w:rPr>
+        <w:t>밝기, 볼륨, 업무 모드, 숨김 앱, 활성 앱/창 상태가 Privacy 실행 이전 기준으로 가능한 범위에서 복구되는지 확인한다.</w:t>
       </w:r>
     </w:p>
     <w:p>
@@ -3177,7 +4518,7 @@
                 <w:rFonts w:ascii="AppleGothic" w:hAnsi="AppleGothic" w:eastAsia="AppleGothic" w:cs="AppleGothic"/>
                 <w:sz w:val="20"/>
               </w:rPr>
-              <w:t>앱 기능명은 Flick Arrange, Flick Focus, Flick Hide로 표기한다.</w:t>
+              <w:t>앱 기능명은 Flick Arrange, Flick Privacy로 표기한다.</w:t>
             </w:r>
           </w:p>
         </w:tc>
@@ -3215,7 +4556,511 @@
                 <w:rFonts w:ascii="AppleGothic" w:hAnsi="AppleGothic" w:eastAsia="AppleGothic" w:cs="AppleGothic"/>
                 <w:sz w:val="20"/>
               </w:rPr>
-              <w:t>Flick Focus</w:t>
+              <w:t>Open 기본 할당</w:t>
+            </w:r>
+          </w:p>
+        </w:tc>
+        <w:tc>
+          <w:tcPr>
+            <w:tcW w:type="dxa" w:w="5160"/>
+            <w:vAlign w:val="center"/>
+          </w:tcPr>
+          <w:p>
+            <w:pPr>
+              <w:spacing w:before="0" w:after="80"/>
+            </w:pPr>
+            <w:r>
+              <w:rPr>
+                <w:rFonts w:ascii="AppleGothic" w:hAnsi="AppleGothic" w:eastAsia="AppleGothic" w:cs="AppleGothic"/>
+                <w:sz w:val="20"/>
+              </w:rPr>
+              <w:t>Close에 Flick Privacy가 할당되면 Open에 Flick Privacy Cancel이 기본 할당된다.</w:t>
+            </w:r>
+          </w:p>
+        </w:tc>
+        <w:tc>
+          <w:tcPr>
+            <w:tcW w:type="dxa" w:w="1800"/>
+            <w:vAlign w:val="center"/>
+          </w:tcPr>
+          <w:p>
+            <w:pPr>
+              <w:spacing w:before="0" w:after="80"/>
+            </w:pPr>
+            <w:r>
+              <w:rPr>
+                <w:rFonts w:ascii="AppleGothic" w:hAnsi="AppleGothic" w:eastAsia="AppleGothic" w:cs="AppleGothic"/>
+                <w:sz w:val="20"/>
+              </w:rPr>
+              <w:t>확인 필요</w:t>
+            </w:r>
+          </w:p>
+        </w:tc>
+      </w:tr>
+      <w:tr>
+        <w:tc>
+          <w:tcPr>
+            <w:tcW w:type="dxa" w:w="2400"/>
+            <w:vAlign w:val="center"/>
+          </w:tcPr>
+          <w:p>
+            <w:pPr>
+              <w:spacing w:before="0" w:after="80"/>
+            </w:pPr>
+            <w:r>
+              <w:rPr>
+                <w:rFonts w:ascii="AppleGothic" w:hAnsi="AppleGothic" w:eastAsia="AppleGothic" w:cs="AppleGothic"/>
+                <w:sz w:val="20"/>
+              </w:rPr>
+              <w:t>Open 수정 가능</w:t>
+            </w:r>
+          </w:p>
+        </w:tc>
+        <w:tc>
+          <w:tcPr>
+            <w:tcW w:type="dxa" w:w="5160"/>
+            <w:vAlign w:val="center"/>
+          </w:tcPr>
+          <w:p>
+            <w:pPr>
+              <w:spacing w:before="0" w:after="80"/>
+            </w:pPr>
+            <w:r>
+              <w:rPr>
+                <w:rFonts w:ascii="AppleGothic" w:hAnsi="AppleGothic" w:eastAsia="AppleGothic" w:cs="AppleGothic"/>
+                <w:sz w:val="20"/>
+              </w:rPr>
+              <w:t>사용자가 Open에 할당된 Flick Privacy Cancel을 다른 기능으로 변경할 수 있다.</w:t>
+            </w:r>
+          </w:p>
+        </w:tc>
+        <w:tc>
+          <w:tcPr>
+            <w:tcW w:type="dxa" w:w="1800"/>
+            <w:vAlign w:val="center"/>
+          </w:tcPr>
+          <w:p>
+            <w:pPr>
+              <w:spacing w:before="0" w:after="80"/>
+            </w:pPr>
+            <w:r>
+              <w:rPr>
+                <w:rFonts w:ascii="AppleGothic" w:hAnsi="AppleGothic" w:eastAsia="AppleGothic" w:cs="AppleGothic"/>
+                <w:sz w:val="20"/>
+              </w:rPr>
+              <w:t>확인 필요</w:t>
+            </w:r>
+          </w:p>
+        </w:tc>
+      </w:tr>
+      <w:tr>
+        <w:tc>
+          <w:tcPr>
+            <w:tcW w:type="dxa" w:w="2400"/>
+            <w:vAlign w:val="center"/>
+          </w:tcPr>
+          <w:p>
+            <w:pPr>
+              <w:spacing w:before="0" w:after="80"/>
+            </w:pPr>
+            <w:r>
+              <w:rPr>
+                <w:rFonts w:ascii="AppleGothic" w:hAnsi="AppleGothic" w:eastAsia="AppleGothic" w:cs="AppleGothic"/>
+                <w:sz w:val="20"/>
+              </w:rPr>
+              <w:t>세부 설정</w:t>
+            </w:r>
+          </w:p>
+        </w:tc>
+        <w:tc>
+          <w:tcPr>
+            <w:tcW w:type="dxa" w:w="5160"/>
+            <w:vAlign w:val="center"/>
+          </w:tcPr>
+          <w:p>
+            <w:pPr>
+              <w:spacing w:before="0" w:after="80"/>
+            </w:pPr>
+            <w:r>
+              <w:rPr>
+                <w:rFonts w:ascii="AppleGothic" w:hAnsi="AppleGothic" w:eastAsia="AppleGothic" w:cs="AppleGothic"/>
+                <w:sz w:val="20"/>
+              </w:rPr>
+              <w:t>Flick Privacy의 6개 세부 기능을 각각 on/off 할 수 있다.</w:t>
+            </w:r>
+          </w:p>
+        </w:tc>
+        <w:tc>
+          <w:tcPr>
+            <w:tcW w:type="dxa" w:w="1800"/>
+            <w:vAlign w:val="center"/>
+          </w:tcPr>
+          <w:p>
+            <w:pPr>
+              <w:spacing w:before="0" w:after="80"/>
+            </w:pPr>
+            <w:r>
+              <w:rPr>
+                <w:rFonts w:ascii="AppleGothic" w:hAnsi="AppleGothic" w:eastAsia="AppleGothic" w:cs="AppleGothic"/>
+                <w:sz w:val="20"/>
+              </w:rPr>
+              <w:t>확인 필요</w:t>
+            </w:r>
+          </w:p>
+        </w:tc>
+      </w:tr>
+      <w:tr>
+        <w:tc>
+          <w:tcPr>
+            <w:tcW w:type="dxa" w:w="2400"/>
+            <w:vAlign w:val="center"/>
+          </w:tcPr>
+          <w:p>
+            <w:pPr>
+              <w:spacing w:before="0" w:after="80"/>
+            </w:pPr>
+            <w:r>
+              <w:rPr>
+                <w:rFonts w:ascii="AppleGothic" w:hAnsi="AppleGothic" w:eastAsia="AppleGothic" w:cs="AppleGothic"/>
+                <w:sz w:val="20"/>
+              </w:rPr>
+              <w:t>상태 스냅샷</w:t>
+            </w:r>
+          </w:p>
+        </w:tc>
+        <w:tc>
+          <w:tcPr>
+            <w:tcW w:type="dxa" w:w="5160"/>
+            <w:vAlign w:val="center"/>
+          </w:tcPr>
+          <w:p>
+            <w:pPr>
+              <w:spacing w:before="0" w:after="80"/>
+            </w:pPr>
+            <w:r>
+              <w:rPr>
+                <w:rFonts w:ascii="AppleGothic" w:hAnsi="AppleGothic" w:eastAsia="AppleGothic" w:cs="AppleGothic"/>
+                <w:sz w:val="20"/>
+              </w:rPr>
+              <w:t>Flick Privacy 실행 전 복구용 상태를 저장한다.</w:t>
+            </w:r>
+          </w:p>
+        </w:tc>
+        <w:tc>
+          <w:tcPr>
+            <w:tcW w:type="dxa" w:w="1800"/>
+            <w:vAlign w:val="center"/>
+          </w:tcPr>
+          <w:p>
+            <w:pPr>
+              <w:spacing w:before="0" w:after="80"/>
+            </w:pPr>
+            <w:r>
+              <w:rPr>
+                <w:rFonts w:ascii="AppleGothic" w:hAnsi="AppleGothic" w:eastAsia="AppleGothic" w:cs="AppleGothic"/>
+                <w:sz w:val="20"/>
+              </w:rPr>
+              <w:t>확인 필요</w:t>
+            </w:r>
+          </w:p>
+        </w:tc>
+      </w:tr>
+      <w:tr>
+        <w:tc>
+          <w:tcPr>
+            <w:tcW w:type="dxa" w:w="2400"/>
+            <w:vAlign w:val="center"/>
+          </w:tcPr>
+          <w:p>
+            <w:pPr>
+              <w:spacing w:before="0" w:after="80"/>
+            </w:pPr>
+            <w:r>
+              <w:rPr>
+                <w:rFonts w:ascii="AppleGothic" w:hAnsi="AppleGothic" w:eastAsia="AppleGothic" w:cs="AppleGothic"/>
+                <w:sz w:val="20"/>
+              </w:rPr>
+              <w:t>밝기</w:t>
+            </w:r>
+          </w:p>
+        </w:tc>
+        <w:tc>
+          <w:tcPr>
+            <w:tcW w:type="dxa" w:w="5160"/>
+            <w:vAlign w:val="center"/>
+          </w:tcPr>
+          <w:p>
+            <w:pPr>
+              <w:spacing w:before="0" w:after="80"/>
+            </w:pPr>
+            <w:r>
+              <w:rPr>
+                <w:rFonts w:ascii="AppleGothic" w:hAnsi="AppleGothic" w:eastAsia="AppleGothic" w:cs="AppleGothic"/>
+                <w:sz w:val="20"/>
+              </w:rPr>
+              <w:t>기본값은 전체 밝기 기준 30%이며 슬라이더로 조절 가능하다.</w:t>
+            </w:r>
+          </w:p>
+        </w:tc>
+        <w:tc>
+          <w:tcPr>
+            <w:tcW w:type="dxa" w:w="1800"/>
+            <w:vAlign w:val="center"/>
+          </w:tcPr>
+          <w:p>
+            <w:pPr>
+              <w:spacing w:before="0" w:after="80"/>
+            </w:pPr>
+            <w:r>
+              <w:rPr>
+                <w:rFonts w:ascii="AppleGothic" w:hAnsi="AppleGothic" w:eastAsia="AppleGothic" w:cs="AppleGothic"/>
+                <w:sz w:val="20"/>
+              </w:rPr>
+              <w:t>확인 필요</w:t>
+            </w:r>
+          </w:p>
+        </w:tc>
+      </w:tr>
+      <w:tr>
+        <w:tc>
+          <w:tcPr>
+            <w:tcW w:type="dxa" w:w="2400"/>
+            <w:vAlign w:val="center"/>
+          </w:tcPr>
+          <w:p>
+            <w:pPr>
+              <w:spacing w:before="0" w:after="80"/>
+            </w:pPr>
+            <w:r>
+              <w:rPr>
+                <w:rFonts w:ascii="AppleGothic" w:hAnsi="AppleGothic" w:eastAsia="AppleGothic" w:cs="AppleGothic"/>
+                <w:sz w:val="20"/>
+              </w:rPr>
+              <w:t>볼륨</w:t>
+            </w:r>
+          </w:p>
+        </w:tc>
+        <w:tc>
+          <w:tcPr>
+            <w:tcW w:type="dxa" w:w="5160"/>
+            <w:vAlign w:val="center"/>
+          </w:tcPr>
+          <w:p>
+            <w:pPr>
+              <w:spacing w:before="0" w:after="80"/>
+            </w:pPr>
+            <w:r>
+              <w:rPr>
+                <w:rFonts w:ascii="AppleGothic" w:hAnsi="AppleGothic" w:eastAsia="AppleGothic" w:cs="AppleGothic"/>
+                <w:sz w:val="20"/>
+              </w:rPr>
+              <w:t>볼륨 기능이 켜져 있으면 시스템 볼륨이 0%가 된다.</w:t>
+            </w:r>
+          </w:p>
+        </w:tc>
+        <w:tc>
+          <w:tcPr>
+            <w:tcW w:type="dxa" w:w="1800"/>
+            <w:vAlign w:val="center"/>
+          </w:tcPr>
+          <w:p>
+            <w:pPr>
+              <w:spacing w:before="0" w:after="80"/>
+            </w:pPr>
+            <w:r>
+              <w:rPr>
+                <w:rFonts w:ascii="AppleGothic" w:hAnsi="AppleGothic" w:eastAsia="AppleGothic" w:cs="AppleGothic"/>
+                <w:sz w:val="20"/>
+              </w:rPr>
+              <w:t>확인 필요</w:t>
+            </w:r>
+          </w:p>
+        </w:tc>
+      </w:tr>
+      <w:tr>
+        <w:tc>
+          <w:tcPr>
+            <w:tcW w:type="dxa" w:w="2400"/>
+            <w:vAlign w:val="center"/>
+          </w:tcPr>
+          <w:p>
+            <w:pPr>
+              <w:spacing w:before="0" w:after="80"/>
+            </w:pPr>
+            <w:r>
+              <w:rPr>
+                <w:rFonts w:ascii="AppleGothic" w:hAnsi="AppleGothic" w:eastAsia="AppleGothic" w:cs="AppleGothic"/>
+                <w:sz w:val="20"/>
+              </w:rPr>
+              <w:t>민감 앱 숨김</w:t>
+            </w:r>
+          </w:p>
+        </w:tc>
+        <w:tc>
+          <w:tcPr>
+            <w:tcW w:type="dxa" w:w="5160"/>
+            <w:vAlign w:val="center"/>
+          </w:tcPr>
+          <w:p>
+            <w:pPr>
+              <w:spacing w:before="0" w:after="80"/>
+            </w:pPr>
+            <w:r>
+              <w:rPr>
+                <w:rFonts w:ascii="AppleGothic" w:hAnsi="AppleGothic" w:eastAsia="AppleGothic" w:cs="AppleGothic"/>
+                <w:sz w:val="20"/>
+              </w:rPr>
+              <w:t>기본 메신저/메일 앱과 사용자 지정 앱을 숨길 수 있다.</w:t>
+            </w:r>
+          </w:p>
+        </w:tc>
+        <w:tc>
+          <w:tcPr>
+            <w:tcW w:type="dxa" w:w="1800"/>
+            <w:vAlign w:val="center"/>
+          </w:tcPr>
+          <w:p>
+            <w:pPr>
+              <w:spacing w:before="0" w:after="80"/>
+            </w:pPr>
+            <w:r>
+              <w:rPr>
+                <w:rFonts w:ascii="AppleGothic" w:hAnsi="AppleGothic" w:eastAsia="AppleGothic" w:cs="AppleGothic"/>
+                <w:sz w:val="20"/>
+              </w:rPr>
+              <w:t>확인 필요</w:t>
+            </w:r>
+          </w:p>
+        </w:tc>
+      </w:tr>
+      <w:tr>
+        <w:tc>
+          <w:tcPr>
+            <w:tcW w:type="dxa" w:w="2400"/>
+            <w:vAlign w:val="center"/>
+          </w:tcPr>
+          <w:p>
+            <w:pPr>
+              <w:spacing w:before="0" w:after="80"/>
+            </w:pPr>
+            <w:r>
+              <w:rPr>
+                <w:rFonts w:ascii="AppleGothic" w:hAnsi="AppleGothic" w:eastAsia="AppleGothic" w:cs="AppleGothic"/>
+                <w:sz w:val="20"/>
+              </w:rPr>
+              <w:t>업무 모드</w:t>
+            </w:r>
+          </w:p>
+        </w:tc>
+        <w:tc>
+          <w:tcPr>
+            <w:tcW w:type="dxa" w:w="5160"/>
+            <w:vAlign w:val="center"/>
+          </w:tcPr>
+          <w:p>
+            <w:pPr>
+              <w:spacing w:before="0" w:after="80"/>
+            </w:pPr>
+            <w:r>
+              <w:rPr>
+                <w:rFonts w:ascii="AppleGothic" w:hAnsi="AppleGothic" w:eastAsia="AppleGothic" w:cs="AppleGothic"/>
+                <w:sz w:val="20"/>
+              </w:rPr>
+              <w:t>업무 모드 전환을 시도하고 제한이 있으면 사용자에게 안내한다.</w:t>
+            </w:r>
+          </w:p>
+        </w:tc>
+        <w:tc>
+          <w:tcPr>
+            <w:tcW w:type="dxa" w:w="1800"/>
+            <w:vAlign w:val="center"/>
+          </w:tcPr>
+          <w:p>
+            <w:pPr>
+              <w:spacing w:before="0" w:after="80"/>
+            </w:pPr>
+            <w:r>
+              <w:rPr>
+                <w:rFonts w:ascii="AppleGothic" w:hAnsi="AppleGothic" w:eastAsia="AppleGothic" w:cs="AppleGothic"/>
+                <w:sz w:val="20"/>
+              </w:rPr>
+              <w:t>확인 필요</w:t>
+            </w:r>
+          </w:p>
+        </w:tc>
+      </w:tr>
+      <w:tr>
+        <w:tc>
+          <w:tcPr>
+            <w:tcW w:type="dxa" w:w="2400"/>
+            <w:vAlign w:val="center"/>
+          </w:tcPr>
+          <w:p>
+            <w:pPr>
+              <w:spacing w:before="0" w:after="80"/>
+            </w:pPr>
+            <w:r>
+              <w:rPr>
+                <w:rFonts w:ascii="AppleGothic" w:hAnsi="AppleGothic" w:eastAsia="AppleGothic" w:cs="AppleGothic"/>
+                <w:sz w:val="20"/>
+              </w:rPr>
+              <w:t>미디어</w:t>
+            </w:r>
+          </w:p>
+        </w:tc>
+        <w:tc>
+          <w:tcPr>
+            <w:tcW w:type="dxa" w:w="5160"/>
+            <w:vAlign w:val="center"/>
+          </w:tcPr>
+          <w:p>
+            <w:pPr>
+              <w:spacing w:before="0" w:after="80"/>
+            </w:pPr>
+            <w:r>
+              <w:rPr>
+                <w:rFonts w:ascii="AppleGothic" w:hAnsi="AppleGothic" w:eastAsia="AppleGothic" w:cs="AppleGothic"/>
+                <w:sz w:val="20"/>
+              </w:rPr>
+              <w:t>현재 시스템 미디어 재생에 Pause 명령을 보낸다.</w:t>
+            </w:r>
+          </w:p>
+        </w:tc>
+        <w:tc>
+          <w:tcPr>
+            <w:tcW w:type="dxa" w:w="1800"/>
+            <w:vAlign w:val="center"/>
+          </w:tcPr>
+          <w:p>
+            <w:pPr>
+              <w:spacing w:before="0" w:after="80"/>
+            </w:pPr>
+            <w:r>
+              <w:rPr>
+                <w:rFonts w:ascii="AppleGothic" w:hAnsi="AppleGothic" w:eastAsia="AppleGothic" w:cs="AppleGothic"/>
+                <w:sz w:val="20"/>
+              </w:rPr>
+              <w:t>확인 필요</w:t>
+            </w:r>
+          </w:p>
+        </w:tc>
+      </w:tr>
+      <w:tr>
+        <w:tc>
+          <w:tcPr>
+            <w:tcW w:type="dxa" w:w="2400"/>
+            <w:vAlign w:val="center"/>
+          </w:tcPr>
+          <w:p>
+            <w:pPr>
+              <w:spacing w:before="0" w:after="80"/>
+            </w:pPr>
+            <w:r>
+              <w:rPr>
+                <w:rFonts w:ascii="AppleGothic" w:hAnsi="AppleGothic" w:eastAsia="AppleGothic" w:cs="AppleGothic"/>
+                <w:sz w:val="20"/>
+              </w:rPr>
+              <w:t>Flick Focus 재사용</w:t>
             </w:r>
           </w:p>
         </w:tc>
@@ -3271,7 +5116,7 @@
                 <w:rFonts w:ascii="AppleGothic" w:hAnsi="AppleGothic" w:eastAsia="AppleGothic" w:cs="AppleGothic"/>
                 <w:sz w:val="20"/>
               </w:rPr>
-              <w:t>Flick Hide</w:t>
+              <w:t>Cancel 복구</w:t>
             </w:r>
           </w:p>
         </w:tc>
@@ -3289,7 +5134,7 @@
                 <w:rFonts w:ascii="AppleGothic" w:hAnsi="AppleGothic" w:eastAsia="AppleGothic" w:cs="AppleGothic"/>
                 <w:sz w:val="20"/>
               </w:rPr>
-              <w:t>모든 일반 앱 창을 숨기고 Desktop 접근이 가능하다.</w:t>
+              <w:t>Open 제스처로 Privacy 이전 밝기, 볼륨, 업무 모드, 숨김 앱, 활성 창 상태 복구를 시도한다.</w:t>
             </w:r>
           </w:p>
         </w:tc>
@@ -3454,7 +5299,7 @@
           <w:rFonts w:ascii="AppleGothic" w:hAnsi="AppleGothic" w:eastAsia="AppleGothic" w:cs="AppleGothic"/>
           <w:sz w:val="22"/>
         </w:rPr>
-        <w:t>Open 제스처 기반 기능은 현재 개발 범위에서 제외하며, MVP 검증 이후 별도 기획으로 전환한다.</w:t>
+        <w:t>Open 제스처는 현재 Flick Privacy Cancel의 기본 실행 트리거로 사용한다. Launcher, Recent Apps, Recall 같은 Open 기반 확장 기능과 Flick Focus/Flick Hide의 독립 기능화는 현재 개발 범위에서 제외하며, Flick Privacy / Cancel 검증 이후 별도 기획으로 전환한다.</w:t>
       </w:r>
     </w:p>
     <w:p>
@@ -3520,7 +5365,7 @@
           <w:rFonts w:ascii="AppleGothic" w:hAnsi="AppleGothic" w:eastAsia="AppleGothic" w:cs="AppleGothic"/>
           <w:sz w:val="22"/>
         </w:rPr>
-        <w:t>Flick Series의 MVP 확장 방향은 창 관리 기능 자체보다 ‘노트북 힌지를 입력 장치로 사용할 수 있는가’라는 제품 가설 검증에 초점을 둔다. Flick Focus는 이 가설을 가장 명확하게 보여주는 P1 기능이며, Flick Hide는 Desktop 접근이라는 보조 사용 사례를 강화하는 P2 기능이다. 초기 구현은 Close 제스처 중심으로 단순하고 안정적인 실행 경험을 만드는 데 집중한다.</w:t>
+        <w:t>Flick Series의 MVP 확장 방향은 창 관리 기능 자체보다 ‘노트북 힌지를 입력 장치로 사용할 수 있는가’라는 제품 가설 검증에 초점을 둔다. Flick Privacy는 노트북 화면과 소리가 주변에 노출되는 순간을 겨냥하므로, 외부 모니터 고정 환경보다 노트북 환경에서 장점이 선명하다. 초기 구현은 Close 제스처 한 번으로 사용자가 선택한 프라이버시 보호 동작들을 안정적으로 실행하고, Open 제스처 한 번으로 Privacy 이전 환경을 가능한 한 정확히 복구하는 데 집중한다.</w:t>
       </w:r>
     </w:p>
     <w:sectPr>

</xml_diff>